<commit_message>
Make the tool report-only: build reports from customer CSV/JSON inventory exports
Remove live Azure collection (Resource Graph SDK, collect/run commands, azure extras).
Add CSV input next to JSON: Resource Graph Explorer CSV, portal 'All resources' export
(friendly type names mapped to ARM types), flattened tags./properties. columns,
comma/semicolon/tab delimiters. Several input files are merged and de-duplicated.

Checks whose data is missing from the input are reported under 'Data coverage &
limitations' instead of counting as passes; pillars without data show 'Not assessed'
and the overall score states how many pillars it covers.

Add customer-side export scripts (Azure CLI and PowerShell), a 'template' command
and an example inventory CSV.

Co-Authored-By: Claude Opus 5.5 <noreply@anthropic.com>
Claude-Session: https://claude.ai/code/session_01A3HbwoCp6EKz1YzLWTo4jQ
</commit_message>
<xml_diff>
--- a/azure-assessment/sample-reports/contoso-azure-assessment.docx
+++ b/azure-assessment/sample-reports/contoso-azure-assessment.docx
@@ -54,10 +54,21 @@
         <w:rPr>
           <w:b/>
         </w:rPr>
-        <w:t xml:space="preserve">Inventory collected:  </w:t>
+        <w:t xml:space="preserve">Inventory export date:  </w:t>
       </w:r>
       <w:r>
-        <w:t>2026-09-26T07:33:27+00:00</w:t>
+        <w:t>2026-09-20</w:t>
+      </w:r>
+    </w:p>
+    <w:p>
+      <w:r>
+        <w:rPr>
+          <w:b/>
+        </w:rPr>
+        <w:t xml:space="preserve">Inventory source:  </w:t>
+      </w:r>
+      <w:r>
+        <w:t>sample-inventory.csv</w:t>
       </w:r>
     </w:p>
     <w:p>
@@ -428,7 +439,7 @@
         <w:pStyle w:val="ListBullet"/>
       </w:pPr>
       <w:r>
-        <w:t>106 findings were raised: 17 high, 73 medium and 16 low severity, affecting 78 resources.</w:t>
+        <w:t>106 finding(s) were raised: 17 high, 73 medium and 16 low severity, affecting 78 resources.</w:t>
       </w:r>
     </w:p>
     <w:p>
@@ -1255,7 +1266,7 @@
     </w:p>
     <w:p>
       <w:r>
-        <w:t>Resource metadata was collected read-only through Azure Resource Graph for every subscription visible to the assessment identity. Each resource was evaluated against a rule set aligned to the Microsoft Azure Well-Architected Framework pillars (Security, Reliability, Cost Optimization, Operational Excellence) plus a Governance pillar covering tagging, regions and deployment model.</w:t>
+        <w:t>The assessment is based on the resource inventory export supplied by Contoso (sample-inventory.csv). No access to the Azure environment was required. Each resource was evaluated against a rule set aligned to the Microsoft Azure Well-Architected Framework pillars (Security, Reliability, Cost Optimization, Operational Excellence) plus a Governance pillar covering tagging, regions and deployment model.</w:t>
       </w:r>
     </w:p>
     <w:p>

</xml_diff>

<commit_message>
Add infrastructure overview section to the Word and HTML reports
A new section describes the environment in plain English, derived from the
inventory: estate at a glance, subscriptions, regional footprint, compute,
networking, storage, databases, application hosting, security services,
monitoring and governance. Each part has supporting tables and lists its related
findings; each finding links back to the part that describes it. When the export
lacks configuration data the text says what could not be determined.

Word sections are renumbered (3 Infrastructure overview, 4 Inventory charts,
5 Findings, 6 Roadmap). Low-severity text uses a readable dark amber.

Co-Authored-By: Claude Opus 5.5 <noreply@anthropic.com>
Claude-Session: https://claude.ai/code/session_01A3HbwoCp6EKz1YzLWTo4jQ
</commit_message>
<xml_diff>
--- a/azure-assessment/sample-reports/contoso-azure-assessment.docx
+++ b/azure-assessment/sample-reports/contoso-azure-assessment.docx
@@ -1486,7 +1486,4022 @@
         <w:pStyle w:val="Heading1"/>
       </w:pPr>
       <w:r>
-        <w:t>3. Inventory overview</w:t>
+        <w:t>3. Infrastructure overview</w:t>
+      </w:r>
+    </w:p>
+    <w:p>
+      <w:r>
+        <w:t>This section describes the environment as understood from the inventory export: what it contains, how it is organised and how each area is configured. Each part ends with the findings that relate to it, so the description can be read alongside the findings in section 5 and the roadmap in section 6.</w:t>
+      </w:r>
+    </w:p>
+    <w:p>
+      <w:pPr>
+        <w:pStyle w:val="Heading2"/>
+      </w:pPr>
+      <w:r>
+        <w:t>3.1 Estate at a glance</w:t>
+      </w:r>
+    </w:p>
+    <w:p>
+      <w:r>
+        <w:t>The environment described by sample-inventory.csv contains 133 Azure resources organised into 3 subscriptions and 19 resource groups, deployed across 4 regions. eastus is the primary region, hosting 45% of all resources, followed by westeurope (29%), uksouth (20%) and centralindia (6%).</w:t>
+      </w:r>
+    </w:p>
+    <w:p>
+      <w:r>
+        <w:t>By function, the estate is made up of compute (44%), networking (29%), application hosting (9%), storage (8%), databases (6%), security services (3%), monitoring and management (2%) and classic (legacy) resources (1%). The most common resource types are managed disks (34), virtual machines (24), network interfaces (24), storage accounts (10) and App Services (8).</w:t>
+      </w:r>
+    </w:p>
+    <w:p>
+      <w:r>
+        <w:t>The hosting model is predominantly infrastructure-as-a-service (IaaS), built around virtual machines: there are 24 virtual machines alongside 20 managed application or database services.</w:t>
+      </w:r>
+    </w:p>
+    <w:p>
+      <w:pPr>
+        <w:keepNext/>
+      </w:pPr>
+      <w:r>
+        <w:rPr>
+          <w:b/>
+          <w:color w:val="52514E"/>
+          <w:sz w:val="19"/>
+        </w:rPr>
+        <w:t>Resources by functional area</w:t>
+      </w:r>
+    </w:p>
+    <w:tbl>
+      <w:tblPr>
+        <w:tblStyle w:val="TableGrid"/>
+        <w:jc w:val="center"/>
+        <w:tblLayout w:type="fixed"/>
+        <w:tblLook w:firstColumn="1" w:firstRow="1" w:lastColumn="0" w:lastRow="0" w:noHBand="0" w:noVBand="1" w:val="04A0"/>
+        <w:tblW w:w="9746" w:type="dxa"/>
+      </w:tblPr>
+      <w:tblGrid>
+        <w:gridCol w:w="2215"/>
+        <w:gridCol w:w="1402"/>
+        <w:gridCol w:w="1329"/>
+        <w:gridCol w:w="4799"/>
+      </w:tblGrid>
+      <w:tr>
+        <w:trPr>
+          <w:tblHeader w:val="true"/>
+        </w:trPr>
+        <w:tc>
+          <w:tcPr>
+            <w:tcW w:type="dxa" w:w="2215"/>
+            <w:shd w:val="clear" w:color="auto" w:fill="0F3B68"/>
+          </w:tcPr>
+          <w:p>
+            <w:r/>
+            <w:r>
+              <w:rPr>
+                <w:b/>
+                <w:color w:val="FFFFFF"/>
+                <w:sz w:val="18"/>
+              </w:rPr>
+              <w:t>Area</w:t>
+            </w:r>
+          </w:p>
+        </w:tc>
+        <w:tc>
+          <w:tcPr>
+            <w:tcW w:type="dxa" w:w="1403"/>
+            <w:shd w:val="clear" w:color="auto" w:fill="0F3B68"/>
+          </w:tcPr>
+          <w:p>
+            <w:r/>
+            <w:r>
+              <w:rPr>
+                <w:b/>
+                <w:color w:val="FFFFFF"/>
+                <w:sz w:val="18"/>
+              </w:rPr>
+              <w:t>Resources</w:t>
+            </w:r>
+          </w:p>
+        </w:tc>
+        <w:tc>
+          <w:tcPr>
+            <w:tcW w:type="dxa" w:w="1329"/>
+            <w:shd w:val="clear" w:color="auto" w:fill="0F3B68"/>
+          </w:tcPr>
+          <w:p>
+            <w:r/>
+            <w:r>
+              <w:rPr>
+                <w:b/>
+                <w:color w:val="FFFFFF"/>
+                <w:sz w:val="18"/>
+              </w:rPr>
+              <w:t>% of estate</w:t>
+            </w:r>
+          </w:p>
+        </w:tc>
+        <w:tc>
+          <w:tcPr>
+            <w:tcW w:type="dxa" w:w="4799"/>
+            <w:shd w:val="clear" w:color="auto" w:fill="0F3B68"/>
+          </w:tcPr>
+          <w:p>
+            <w:r/>
+            <w:r>
+              <w:rPr>
+                <w:b/>
+                <w:color w:val="FFFFFF"/>
+                <w:sz w:val="18"/>
+              </w:rPr>
+              <w:t>Main resource types</w:t>
+            </w:r>
+          </w:p>
+        </w:tc>
+      </w:tr>
+      <w:tr>
+        <w:tc>
+          <w:tcPr>
+            <w:tcW w:type="dxa" w:w="2215"/>
+          </w:tcPr>
+          <w:p>
+            <w:r/>
+            <w:r>
+              <w:rPr>
+                <w:sz w:val="18"/>
+              </w:rPr>
+              <w:t>Compute</w:t>
+            </w:r>
+          </w:p>
+        </w:tc>
+        <w:tc>
+          <w:tcPr>
+            <w:tcW w:type="dxa" w:w="1403"/>
+          </w:tcPr>
+          <w:p>
+            <w:r/>
+            <w:r>
+              <w:rPr>
+                <w:sz w:val="18"/>
+              </w:rPr>
+              <w:t>58</w:t>
+            </w:r>
+          </w:p>
+        </w:tc>
+        <w:tc>
+          <w:tcPr>
+            <w:tcW w:type="dxa" w:w="1329"/>
+          </w:tcPr>
+          <w:p>
+            <w:r/>
+            <w:r>
+              <w:rPr>
+                <w:sz w:val="18"/>
+              </w:rPr>
+              <w:t>44%</w:t>
+            </w:r>
+          </w:p>
+        </w:tc>
+        <w:tc>
+          <w:tcPr>
+            <w:tcW w:type="dxa" w:w="4799"/>
+          </w:tcPr>
+          <w:p>
+            <w:r/>
+            <w:r>
+              <w:rPr>
+                <w:sz w:val="18"/>
+              </w:rPr>
+              <w:t>Managed disks (34), Virtual machines (24)</w:t>
+            </w:r>
+          </w:p>
+        </w:tc>
+      </w:tr>
+      <w:tr>
+        <w:tc>
+          <w:tcPr>
+            <w:tcW w:type="dxa" w:w="2215"/>
+            <w:shd w:val="clear" w:color="auto" w:fill="F2F5F9"/>
+          </w:tcPr>
+          <w:p>
+            <w:r/>
+            <w:r>
+              <w:rPr>
+                <w:sz w:val="18"/>
+              </w:rPr>
+              <w:t>Networking</w:t>
+            </w:r>
+          </w:p>
+        </w:tc>
+        <w:tc>
+          <w:tcPr>
+            <w:tcW w:type="dxa" w:w="1403"/>
+            <w:shd w:val="clear" w:color="auto" w:fill="F2F5F9"/>
+          </w:tcPr>
+          <w:p>
+            <w:r/>
+            <w:r>
+              <w:rPr>
+                <w:sz w:val="18"/>
+              </w:rPr>
+              <w:t>38</w:t>
+            </w:r>
+          </w:p>
+        </w:tc>
+        <w:tc>
+          <w:tcPr>
+            <w:tcW w:type="dxa" w:w="1329"/>
+            <w:shd w:val="clear" w:color="auto" w:fill="F2F5F9"/>
+          </w:tcPr>
+          <w:p>
+            <w:r/>
+            <w:r>
+              <w:rPr>
+                <w:sz w:val="18"/>
+              </w:rPr>
+              <w:t>29%</w:t>
+            </w:r>
+          </w:p>
+        </w:tc>
+        <w:tc>
+          <w:tcPr>
+            <w:tcW w:type="dxa" w:w="4799"/>
+            <w:shd w:val="clear" w:color="auto" w:fill="F2F5F9"/>
+          </w:tcPr>
+          <w:p>
+            <w:r/>
+            <w:r>
+              <w:rPr>
+                <w:sz w:val="18"/>
+              </w:rPr>
+              <w:t>Network interfaces (24), Public IP addresses (6), Network security groups (4)</w:t>
+            </w:r>
+          </w:p>
+        </w:tc>
+      </w:tr>
+      <w:tr>
+        <w:tc>
+          <w:tcPr>
+            <w:tcW w:type="dxa" w:w="2215"/>
+          </w:tcPr>
+          <w:p>
+            <w:r/>
+            <w:r>
+              <w:rPr>
+                <w:sz w:val="18"/>
+              </w:rPr>
+              <w:t>Application hosting</w:t>
+            </w:r>
+          </w:p>
+        </w:tc>
+        <w:tc>
+          <w:tcPr>
+            <w:tcW w:type="dxa" w:w="1403"/>
+          </w:tcPr>
+          <w:p>
+            <w:r/>
+            <w:r>
+              <w:rPr>
+                <w:sz w:val="18"/>
+              </w:rPr>
+              <w:t>12</w:t>
+            </w:r>
+          </w:p>
+        </w:tc>
+        <w:tc>
+          <w:tcPr>
+            <w:tcW w:type="dxa" w:w="1329"/>
+          </w:tcPr>
+          <w:p>
+            <w:r/>
+            <w:r>
+              <w:rPr>
+                <w:sz w:val="18"/>
+              </w:rPr>
+              <w:t>9%</w:t>
+            </w:r>
+          </w:p>
+        </w:tc>
+        <w:tc>
+          <w:tcPr>
+            <w:tcW w:type="dxa" w:w="4799"/>
+          </w:tcPr>
+          <w:p>
+            <w:r/>
+            <w:r>
+              <w:rPr>
+                <w:sz w:val="18"/>
+              </w:rPr>
+              <w:t>App Services (8), App Service plans (4)</w:t>
+            </w:r>
+          </w:p>
+        </w:tc>
+      </w:tr>
+      <w:tr>
+        <w:tc>
+          <w:tcPr>
+            <w:tcW w:type="dxa" w:w="2215"/>
+            <w:shd w:val="clear" w:color="auto" w:fill="F2F5F9"/>
+          </w:tcPr>
+          <w:p>
+            <w:r/>
+            <w:r>
+              <w:rPr>
+                <w:sz w:val="18"/>
+              </w:rPr>
+              <w:t>Storage</w:t>
+            </w:r>
+          </w:p>
+        </w:tc>
+        <w:tc>
+          <w:tcPr>
+            <w:tcW w:type="dxa" w:w="1403"/>
+            <w:shd w:val="clear" w:color="auto" w:fill="F2F5F9"/>
+          </w:tcPr>
+          <w:p>
+            <w:r/>
+            <w:r>
+              <w:rPr>
+                <w:sz w:val="18"/>
+              </w:rPr>
+              <w:t>10</w:t>
+            </w:r>
+          </w:p>
+        </w:tc>
+        <w:tc>
+          <w:tcPr>
+            <w:tcW w:type="dxa" w:w="1329"/>
+            <w:shd w:val="clear" w:color="auto" w:fill="F2F5F9"/>
+          </w:tcPr>
+          <w:p>
+            <w:r/>
+            <w:r>
+              <w:rPr>
+                <w:sz w:val="18"/>
+              </w:rPr>
+              <w:t>8%</w:t>
+            </w:r>
+          </w:p>
+        </w:tc>
+        <w:tc>
+          <w:tcPr>
+            <w:tcW w:type="dxa" w:w="4799"/>
+            <w:shd w:val="clear" w:color="auto" w:fill="F2F5F9"/>
+          </w:tcPr>
+          <w:p>
+            <w:r/>
+            <w:r>
+              <w:rPr>
+                <w:sz w:val="18"/>
+              </w:rPr>
+              <w:t>Storage accounts (10)</w:t>
+            </w:r>
+          </w:p>
+        </w:tc>
+      </w:tr>
+      <w:tr>
+        <w:tc>
+          <w:tcPr>
+            <w:tcW w:type="dxa" w:w="2215"/>
+          </w:tcPr>
+          <w:p>
+            <w:r/>
+            <w:r>
+              <w:rPr>
+                <w:sz w:val="18"/>
+              </w:rPr>
+              <w:t>Databases</w:t>
+            </w:r>
+          </w:p>
+        </w:tc>
+        <w:tc>
+          <w:tcPr>
+            <w:tcW w:type="dxa" w:w="1403"/>
+          </w:tcPr>
+          <w:p>
+            <w:r/>
+            <w:r>
+              <w:rPr>
+                <w:sz w:val="18"/>
+              </w:rPr>
+              <w:t>8</w:t>
+            </w:r>
+          </w:p>
+        </w:tc>
+        <w:tc>
+          <w:tcPr>
+            <w:tcW w:type="dxa" w:w="1329"/>
+          </w:tcPr>
+          <w:p>
+            <w:r/>
+            <w:r>
+              <w:rPr>
+                <w:sz w:val="18"/>
+              </w:rPr>
+              <w:t>6%</w:t>
+            </w:r>
+          </w:p>
+        </w:tc>
+        <w:tc>
+          <w:tcPr>
+            <w:tcW w:type="dxa" w:w="4799"/>
+          </w:tcPr>
+          <w:p>
+            <w:r/>
+            <w:r>
+              <w:rPr>
+                <w:sz w:val="18"/>
+              </w:rPr>
+              <w:t>SQL databases (6), SQL servers (2)</w:t>
+            </w:r>
+          </w:p>
+        </w:tc>
+      </w:tr>
+      <w:tr>
+        <w:tc>
+          <w:tcPr>
+            <w:tcW w:type="dxa" w:w="2215"/>
+            <w:shd w:val="clear" w:color="auto" w:fill="F2F5F9"/>
+          </w:tcPr>
+          <w:p>
+            <w:r/>
+            <w:r>
+              <w:rPr>
+                <w:sz w:val="18"/>
+              </w:rPr>
+              <w:t>Security services</w:t>
+            </w:r>
+          </w:p>
+        </w:tc>
+        <w:tc>
+          <w:tcPr>
+            <w:tcW w:type="dxa" w:w="1403"/>
+            <w:shd w:val="clear" w:color="auto" w:fill="F2F5F9"/>
+          </w:tcPr>
+          <w:p>
+            <w:r/>
+            <w:r>
+              <w:rPr>
+                <w:sz w:val="18"/>
+              </w:rPr>
+              <w:t>4</w:t>
+            </w:r>
+          </w:p>
+        </w:tc>
+        <w:tc>
+          <w:tcPr>
+            <w:tcW w:type="dxa" w:w="1329"/>
+            <w:shd w:val="clear" w:color="auto" w:fill="F2F5F9"/>
+          </w:tcPr>
+          <w:p>
+            <w:r/>
+            <w:r>
+              <w:rPr>
+                <w:sz w:val="18"/>
+              </w:rPr>
+              <w:t>3%</w:t>
+            </w:r>
+          </w:p>
+        </w:tc>
+        <w:tc>
+          <w:tcPr>
+            <w:tcW w:type="dxa" w:w="4799"/>
+            <w:shd w:val="clear" w:color="auto" w:fill="F2F5F9"/>
+          </w:tcPr>
+          <w:p>
+            <w:r/>
+            <w:r>
+              <w:rPr>
+                <w:sz w:val="18"/>
+              </w:rPr>
+              <w:t>Key vaults (4)</w:t>
+            </w:r>
+          </w:p>
+        </w:tc>
+      </w:tr>
+      <w:tr>
+        <w:tc>
+          <w:tcPr>
+            <w:tcW w:type="dxa" w:w="2215"/>
+          </w:tcPr>
+          <w:p>
+            <w:r/>
+            <w:r>
+              <w:rPr>
+                <w:sz w:val="18"/>
+              </w:rPr>
+              <w:t>Monitoring and management</w:t>
+            </w:r>
+          </w:p>
+        </w:tc>
+        <w:tc>
+          <w:tcPr>
+            <w:tcW w:type="dxa" w:w="1403"/>
+          </w:tcPr>
+          <w:p>
+            <w:r/>
+            <w:r>
+              <w:rPr>
+                <w:sz w:val="18"/>
+              </w:rPr>
+              <w:t>2</w:t>
+            </w:r>
+          </w:p>
+        </w:tc>
+        <w:tc>
+          <w:tcPr>
+            <w:tcW w:type="dxa" w:w="1329"/>
+          </w:tcPr>
+          <w:p>
+            <w:r/>
+            <w:r>
+              <w:rPr>
+                <w:sz w:val="18"/>
+              </w:rPr>
+              <w:t>2%</w:t>
+            </w:r>
+          </w:p>
+        </w:tc>
+        <w:tc>
+          <w:tcPr>
+            <w:tcW w:type="dxa" w:w="4799"/>
+          </w:tcPr>
+          <w:p>
+            <w:r/>
+            <w:r>
+              <w:rPr>
+                <w:sz w:val="18"/>
+              </w:rPr>
+              <w:t>Log Analytics workspaces (2)</w:t>
+            </w:r>
+          </w:p>
+        </w:tc>
+      </w:tr>
+      <w:tr>
+        <w:tc>
+          <w:tcPr>
+            <w:tcW w:type="dxa" w:w="2215"/>
+            <w:shd w:val="clear" w:color="auto" w:fill="F2F5F9"/>
+          </w:tcPr>
+          <w:p>
+            <w:r/>
+            <w:r>
+              <w:rPr>
+                <w:sz w:val="18"/>
+              </w:rPr>
+              <w:t>Classic (legacy) resources</w:t>
+            </w:r>
+          </w:p>
+        </w:tc>
+        <w:tc>
+          <w:tcPr>
+            <w:tcW w:type="dxa" w:w="1403"/>
+            <w:shd w:val="clear" w:color="auto" w:fill="F2F5F9"/>
+          </w:tcPr>
+          <w:p>
+            <w:r/>
+            <w:r>
+              <w:rPr>
+                <w:sz w:val="18"/>
+              </w:rPr>
+              <w:t>1</w:t>
+            </w:r>
+          </w:p>
+        </w:tc>
+        <w:tc>
+          <w:tcPr>
+            <w:tcW w:type="dxa" w:w="1329"/>
+            <w:shd w:val="clear" w:color="auto" w:fill="F2F5F9"/>
+          </w:tcPr>
+          <w:p>
+            <w:r/>
+            <w:r>
+              <w:rPr>
+                <w:sz w:val="18"/>
+              </w:rPr>
+              <w:t>1%</w:t>
+            </w:r>
+          </w:p>
+        </w:tc>
+        <w:tc>
+          <w:tcPr>
+            <w:tcW w:type="dxa" w:w="4799"/>
+            <w:shd w:val="clear" w:color="auto" w:fill="F2F5F9"/>
+          </w:tcPr>
+          <w:p>
+            <w:r/>
+            <w:r>
+              <w:rPr>
+                <w:sz w:val="18"/>
+              </w:rPr>
+              <w:t>Classic cloud services (1)</w:t>
+            </w:r>
+          </w:p>
+        </w:tc>
+      </w:tr>
+    </w:tbl>
+    <w:p/>
+    <w:p>
+      <w:pPr>
+        <w:pStyle w:val="Heading2"/>
+      </w:pPr>
+      <w:r>
+        <w:t>3.2 Subscriptions and resource organisation</w:t>
+      </w:r>
+    </w:p>
+    <w:p>
+      <w:r>
+        <w:t>Resources are spread across 3 subscriptions. The breakdown below describes what each subscription contains, which helps show how workloads and environments are separated.</w:t>
+      </w:r>
+    </w:p>
+    <w:p>
+      <w:r>
+        <w:t>On average a resource group holds 7.0 resources. The largest are rg-prd-app01 in Contoso-Production (18), rg-dev-app01 in Contoso-NonProduction (13) and rg-prd-app02 in Contoso-Production (12).</w:t>
+      </w:r>
+    </w:p>
+    <w:p>
+      <w:pPr>
+        <w:pStyle w:val="ListBullet"/>
+      </w:pPr>
+      <w:r>
+        <w:rPr>
+          <w:b/>
+        </w:rPr>
+        <w:t xml:space="preserve">Contoso-Production: </w:t>
+      </w:r>
+      <w:r>
+        <w:t>66 resources in 8 resource groups across 4 regions (centralindia, eastus, uksouth and westeurope). It mainly contains managed disks (20), virtual machines (14) and network interfaces (14). Resources are tagged as environment 'prod'.</w:t>
+      </w:r>
+    </w:p>
+    <w:p>
+      <w:pPr>
+        <w:pStyle w:val="ListBullet"/>
+      </w:pPr>
+      <w:r>
+        <w:rPr>
+          <w:b/>
+        </w:rPr>
+        <w:t xml:space="preserve">Contoso-NonProduction: </w:t>
+      </w:r>
+      <w:r>
+        <w:t>52 resources in 8 resource groups across 4 regions (centralindia, eastus, uksouth and westeurope). It mainly contains managed disks (14), virtual machines (10) and network interfaces (10). Resources are tagged as environment 'dev'.</w:t>
+      </w:r>
+    </w:p>
+    <w:p>
+      <w:pPr>
+        <w:pStyle w:val="ListBullet"/>
+      </w:pPr>
+      <w:r>
+        <w:rPr>
+          <w:b/>
+        </w:rPr>
+        <w:t xml:space="preserve">Contoso-Connectivity: </w:t>
+      </w:r>
+      <w:r>
+        <w:t>15 resources in 3 resource groups across 2 regions (eastus and westeurope). It mainly contains public IP addresses (6), network security groups (4) and virtual networks (2). Resources are tagged as environment 'shared'.</w:t>
+      </w:r>
+    </w:p>
+    <w:p>
+      <w:pPr>
+        <w:keepNext/>
+      </w:pPr>
+      <w:r>
+        <w:rPr>
+          <w:b/>
+          <w:color w:val="52514E"/>
+          <w:sz w:val="19"/>
+        </w:rPr>
+        <w:t>Subscription summary</w:t>
+      </w:r>
+    </w:p>
+    <w:tbl>
+      <w:tblPr>
+        <w:tblStyle w:val="TableGrid"/>
+        <w:jc w:val="center"/>
+        <w:tblLayout w:type="fixed"/>
+        <w:tblLook w:firstColumn="1" w:firstRow="1" w:lastColumn="0" w:lastRow="0" w:noHBand="0" w:noVBand="1" w:val="04A0"/>
+        <w:tblW w:w="9746" w:type="dxa"/>
+      </w:tblPr>
+      <w:tblGrid>
+        <w:gridCol w:w="1802"/>
+        <w:gridCol w:w="1468"/>
+        <w:gridCol w:w="1468"/>
+        <w:gridCol w:w="1935"/>
+        <w:gridCol w:w="3070"/>
+      </w:tblGrid>
+      <w:tr>
+        <w:trPr>
+          <w:tblHeader w:val="true"/>
+        </w:trPr>
+        <w:tc>
+          <w:tcPr>
+            <w:tcW w:type="dxa" w:w="1802"/>
+            <w:shd w:val="clear" w:color="auto" w:fill="0F3B68"/>
+          </w:tcPr>
+          <w:p>
+            <w:r/>
+            <w:r>
+              <w:rPr>
+                <w:b/>
+                <w:color w:val="FFFFFF"/>
+                <w:sz w:val="18"/>
+              </w:rPr>
+              <w:t>Subscription</w:t>
+            </w:r>
+          </w:p>
+        </w:tc>
+        <w:tc>
+          <w:tcPr>
+            <w:tcW w:type="dxa" w:w="1469"/>
+            <w:shd w:val="clear" w:color="auto" w:fill="0F3B68"/>
+          </w:tcPr>
+          <w:p>
+            <w:r/>
+            <w:r>
+              <w:rPr>
+                <w:b/>
+                <w:color w:val="FFFFFF"/>
+                <w:sz w:val="18"/>
+              </w:rPr>
+              <w:t>Resources</w:t>
+            </w:r>
+          </w:p>
+        </w:tc>
+        <w:tc>
+          <w:tcPr>
+            <w:tcW w:type="dxa" w:w="1469"/>
+            <w:shd w:val="clear" w:color="auto" w:fill="0F3B68"/>
+          </w:tcPr>
+          <w:p>
+            <w:r/>
+            <w:r>
+              <w:rPr>
+                <w:b/>
+                <w:color w:val="FFFFFF"/>
+                <w:sz w:val="18"/>
+              </w:rPr>
+              <w:t>Resource groups</w:t>
+            </w:r>
+          </w:p>
+        </w:tc>
+        <w:tc>
+          <w:tcPr>
+            <w:tcW w:type="dxa" w:w="1936"/>
+            <w:shd w:val="clear" w:color="auto" w:fill="0F3B68"/>
+          </w:tcPr>
+          <w:p>
+            <w:r/>
+            <w:r>
+              <w:rPr>
+                <w:b/>
+                <w:color w:val="FFFFFF"/>
+                <w:sz w:val="18"/>
+              </w:rPr>
+              <w:t>Regions</w:t>
+            </w:r>
+          </w:p>
+        </w:tc>
+        <w:tc>
+          <w:tcPr>
+            <w:tcW w:type="dxa" w:w="3071"/>
+            <w:shd w:val="clear" w:color="auto" w:fill="0F3B68"/>
+          </w:tcPr>
+          <w:p>
+            <w:r/>
+            <w:r>
+              <w:rPr>
+                <w:b/>
+                <w:color w:val="FFFFFF"/>
+                <w:sz w:val="18"/>
+              </w:rPr>
+              <w:t>Main resource types</w:t>
+            </w:r>
+          </w:p>
+        </w:tc>
+      </w:tr>
+      <w:tr>
+        <w:tc>
+          <w:tcPr>
+            <w:tcW w:type="dxa" w:w="1802"/>
+          </w:tcPr>
+          <w:p>
+            <w:r/>
+            <w:r>
+              <w:rPr>
+                <w:sz w:val="18"/>
+              </w:rPr>
+              <w:t>Contoso-Production</w:t>
+            </w:r>
+          </w:p>
+        </w:tc>
+        <w:tc>
+          <w:tcPr>
+            <w:tcW w:type="dxa" w:w="1469"/>
+          </w:tcPr>
+          <w:p>
+            <w:r/>
+            <w:r>
+              <w:rPr>
+                <w:sz w:val="18"/>
+              </w:rPr>
+              <w:t>66</w:t>
+            </w:r>
+          </w:p>
+        </w:tc>
+        <w:tc>
+          <w:tcPr>
+            <w:tcW w:type="dxa" w:w="1469"/>
+          </w:tcPr>
+          <w:p>
+            <w:r/>
+            <w:r>
+              <w:rPr>
+                <w:sz w:val="18"/>
+              </w:rPr>
+              <w:t>8</w:t>
+            </w:r>
+          </w:p>
+        </w:tc>
+        <w:tc>
+          <w:tcPr>
+            <w:tcW w:type="dxa" w:w="1936"/>
+          </w:tcPr>
+          <w:p>
+            <w:r/>
+            <w:r>
+              <w:rPr>
+                <w:sz w:val="18"/>
+              </w:rPr>
+              <w:t>centralindia, eastus, uksouth, westeurope</w:t>
+            </w:r>
+          </w:p>
+        </w:tc>
+        <w:tc>
+          <w:tcPr>
+            <w:tcW w:type="dxa" w:w="3071"/>
+          </w:tcPr>
+          <w:p>
+            <w:r/>
+            <w:r>
+              <w:rPr>
+                <w:sz w:val="18"/>
+              </w:rPr>
+              <w:t>Managed disks (20), Virtual machines (14), Network interfaces (14)</w:t>
+            </w:r>
+          </w:p>
+        </w:tc>
+      </w:tr>
+      <w:tr>
+        <w:tc>
+          <w:tcPr>
+            <w:tcW w:type="dxa" w:w="1802"/>
+            <w:shd w:val="clear" w:color="auto" w:fill="F2F5F9"/>
+          </w:tcPr>
+          <w:p>
+            <w:r/>
+            <w:r>
+              <w:rPr>
+                <w:sz w:val="18"/>
+              </w:rPr>
+              <w:t>Contoso-NonProduction</w:t>
+            </w:r>
+          </w:p>
+        </w:tc>
+        <w:tc>
+          <w:tcPr>
+            <w:tcW w:type="dxa" w:w="1469"/>
+            <w:shd w:val="clear" w:color="auto" w:fill="F2F5F9"/>
+          </w:tcPr>
+          <w:p>
+            <w:r/>
+            <w:r>
+              <w:rPr>
+                <w:sz w:val="18"/>
+              </w:rPr>
+              <w:t>52</w:t>
+            </w:r>
+          </w:p>
+        </w:tc>
+        <w:tc>
+          <w:tcPr>
+            <w:tcW w:type="dxa" w:w="1469"/>
+            <w:shd w:val="clear" w:color="auto" w:fill="F2F5F9"/>
+          </w:tcPr>
+          <w:p>
+            <w:r/>
+            <w:r>
+              <w:rPr>
+                <w:sz w:val="18"/>
+              </w:rPr>
+              <w:t>8</w:t>
+            </w:r>
+          </w:p>
+        </w:tc>
+        <w:tc>
+          <w:tcPr>
+            <w:tcW w:type="dxa" w:w="1936"/>
+            <w:shd w:val="clear" w:color="auto" w:fill="F2F5F9"/>
+          </w:tcPr>
+          <w:p>
+            <w:r/>
+            <w:r>
+              <w:rPr>
+                <w:sz w:val="18"/>
+              </w:rPr>
+              <w:t>centralindia, eastus, uksouth, westeurope</w:t>
+            </w:r>
+          </w:p>
+        </w:tc>
+        <w:tc>
+          <w:tcPr>
+            <w:tcW w:type="dxa" w:w="3071"/>
+            <w:shd w:val="clear" w:color="auto" w:fill="F2F5F9"/>
+          </w:tcPr>
+          <w:p>
+            <w:r/>
+            <w:r>
+              <w:rPr>
+                <w:sz w:val="18"/>
+              </w:rPr>
+              <w:t>Managed disks (14), Virtual machines (10), Network interfaces (10)</w:t>
+            </w:r>
+          </w:p>
+        </w:tc>
+      </w:tr>
+      <w:tr>
+        <w:tc>
+          <w:tcPr>
+            <w:tcW w:type="dxa" w:w="1802"/>
+          </w:tcPr>
+          <w:p>
+            <w:r/>
+            <w:r>
+              <w:rPr>
+                <w:sz w:val="18"/>
+              </w:rPr>
+              <w:t>Contoso-Connectivity</w:t>
+            </w:r>
+          </w:p>
+        </w:tc>
+        <w:tc>
+          <w:tcPr>
+            <w:tcW w:type="dxa" w:w="1469"/>
+          </w:tcPr>
+          <w:p>
+            <w:r/>
+            <w:r>
+              <w:rPr>
+                <w:sz w:val="18"/>
+              </w:rPr>
+              <w:t>15</w:t>
+            </w:r>
+          </w:p>
+        </w:tc>
+        <w:tc>
+          <w:tcPr>
+            <w:tcW w:type="dxa" w:w="1469"/>
+          </w:tcPr>
+          <w:p>
+            <w:r/>
+            <w:r>
+              <w:rPr>
+                <w:sz w:val="18"/>
+              </w:rPr>
+              <w:t>3</w:t>
+            </w:r>
+          </w:p>
+        </w:tc>
+        <w:tc>
+          <w:tcPr>
+            <w:tcW w:type="dxa" w:w="1936"/>
+          </w:tcPr>
+          <w:p>
+            <w:r/>
+            <w:r>
+              <w:rPr>
+                <w:sz w:val="18"/>
+              </w:rPr>
+              <w:t>eastus, westeurope</w:t>
+            </w:r>
+          </w:p>
+        </w:tc>
+        <w:tc>
+          <w:tcPr>
+            <w:tcW w:type="dxa" w:w="3071"/>
+          </w:tcPr>
+          <w:p>
+            <w:r/>
+            <w:r>
+              <w:rPr>
+                <w:sz w:val="18"/>
+              </w:rPr>
+              <w:t>Public IP addresses (6), Network security groups (4), Virtual networks (2)</w:t>
+            </w:r>
+          </w:p>
+        </w:tc>
+      </w:tr>
+    </w:tbl>
+    <w:p/>
+    <w:p>
+      <w:pPr>
+        <w:pStyle w:val="Heading2"/>
+      </w:pPr>
+      <w:r>
+        <w:t>3.3 Regional footprint</w:t>
+      </w:r>
+    </w:p>
+    <w:p>
+      <w:r>
+        <w:t>Resources are deployed in 4 regions: eastus (60), westeurope (39), uksouth (26) and centralindia (8). Running in several regions gives the option of regional resilience, but only if workloads are actually designed to fail over between them.</w:t>
+      </w:r>
+    </w:p>
+    <w:p>
+      <w:r>
+        <w:t>The approved regions are eastus, westeurope and uksouth. 8 resources sit outside them, in centralindia (8).</w:t>
+      </w:r>
+    </w:p>
+    <w:p>
+      <w:pPr>
+        <w:keepNext/>
+      </w:pPr>
+      <w:r>
+        <w:rPr>
+          <w:b/>
+          <w:color w:val="52514E"/>
+          <w:sz w:val="19"/>
+        </w:rPr>
+        <w:t>Resources by region</w:t>
+      </w:r>
+    </w:p>
+    <w:tbl>
+      <w:tblPr>
+        <w:tblStyle w:val="TableGrid"/>
+        <w:jc w:val="center"/>
+        <w:tblLayout w:type="fixed"/>
+        <w:tblLook w:firstColumn="1" w:firstRow="1" w:lastColumn="0" w:lastRow="0" w:noHBand="0" w:noVBand="1" w:val="04A0"/>
+        <w:tblW w:w="9746" w:type="dxa"/>
+      </w:tblPr>
+      <w:tblGrid>
+        <w:gridCol w:w="1919"/>
+        <w:gridCol w:w="1402"/>
+        <w:gridCol w:w="1329"/>
+        <w:gridCol w:w="5094"/>
+      </w:tblGrid>
+      <w:tr>
+        <w:trPr>
+          <w:tblHeader w:val="true"/>
+        </w:trPr>
+        <w:tc>
+          <w:tcPr>
+            <w:tcW w:type="dxa" w:w="1920"/>
+            <w:shd w:val="clear" w:color="auto" w:fill="0F3B68"/>
+          </w:tcPr>
+          <w:p>
+            <w:r/>
+            <w:r>
+              <w:rPr>
+                <w:b/>
+                <w:color w:val="FFFFFF"/>
+                <w:sz w:val="18"/>
+              </w:rPr>
+              <w:t>Region</w:t>
+            </w:r>
+          </w:p>
+        </w:tc>
+        <w:tc>
+          <w:tcPr>
+            <w:tcW w:type="dxa" w:w="1403"/>
+            <w:shd w:val="clear" w:color="auto" w:fill="0F3B68"/>
+          </w:tcPr>
+          <w:p>
+            <w:r/>
+            <w:r>
+              <w:rPr>
+                <w:b/>
+                <w:color w:val="FFFFFF"/>
+                <w:sz w:val="18"/>
+              </w:rPr>
+              <w:t>Resources</w:t>
+            </w:r>
+          </w:p>
+        </w:tc>
+        <w:tc>
+          <w:tcPr>
+            <w:tcW w:type="dxa" w:w="1329"/>
+            <w:shd w:val="clear" w:color="auto" w:fill="0F3B68"/>
+          </w:tcPr>
+          <w:p>
+            <w:r/>
+            <w:r>
+              <w:rPr>
+                <w:b/>
+                <w:color w:val="FFFFFF"/>
+                <w:sz w:val="18"/>
+              </w:rPr>
+              <w:t>% of estate</w:t>
+            </w:r>
+          </w:p>
+        </w:tc>
+        <w:tc>
+          <w:tcPr>
+            <w:tcW w:type="dxa" w:w="5094"/>
+            <w:shd w:val="clear" w:color="auto" w:fill="0F3B68"/>
+          </w:tcPr>
+          <w:p>
+            <w:r/>
+            <w:r>
+              <w:rPr>
+                <w:b/>
+                <w:color w:val="FFFFFF"/>
+                <w:sz w:val="18"/>
+              </w:rPr>
+              <w:t>Main areas</w:t>
+            </w:r>
+          </w:p>
+        </w:tc>
+      </w:tr>
+      <w:tr>
+        <w:tc>
+          <w:tcPr>
+            <w:tcW w:type="dxa" w:w="1920"/>
+          </w:tcPr>
+          <w:p>
+            <w:r/>
+            <w:r>
+              <w:rPr>
+                <w:sz w:val="18"/>
+              </w:rPr>
+              <w:t>eastus</w:t>
+            </w:r>
+          </w:p>
+        </w:tc>
+        <w:tc>
+          <w:tcPr>
+            <w:tcW w:type="dxa" w:w="1403"/>
+          </w:tcPr>
+          <w:p>
+            <w:r/>
+            <w:r>
+              <w:rPr>
+                <w:sz w:val="18"/>
+              </w:rPr>
+              <w:t>60</w:t>
+            </w:r>
+          </w:p>
+        </w:tc>
+        <w:tc>
+          <w:tcPr>
+            <w:tcW w:type="dxa" w:w="1329"/>
+          </w:tcPr>
+          <w:p>
+            <w:r/>
+            <w:r>
+              <w:rPr>
+                <w:sz w:val="18"/>
+              </w:rPr>
+              <w:t>45%</w:t>
+            </w:r>
+          </w:p>
+        </w:tc>
+        <w:tc>
+          <w:tcPr>
+            <w:tcW w:type="dxa" w:w="5094"/>
+          </w:tcPr>
+          <w:p>
+            <w:r/>
+            <w:r>
+              <w:rPr>
+                <w:sz w:val="18"/>
+              </w:rPr>
+              <w:t>Compute (25), Networking (18), Application hosting (7)</w:t>
+            </w:r>
+          </w:p>
+        </w:tc>
+      </w:tr>
+      <w:tr>
+        <w:tc>
+          <w:tcPr>
+            <w:tcW w:type="dxa" w:w="1920"/>
+            <w:shd w:val="clear" w:color="auto" w:fill="F2F5F9"/>
+          </w:tcPr>
+          <w:p>
+            <w:r/>
+            <w:r>
+              <w:rPr>
+                <w:sz w:val="18"/>
+              </w:rPr>
+              <w:t>westeurope</w:t>
+            </w:r>
+          </w:p>
+        </w:tc>
+        <w:tc>
+          <w:tcPr>
+            <w:tcW w:type="dxa" w:w="1403"/>
+            <w:shd w:val="clear" w:color="auto" w:fill="F2F5F9"/>
+          </w:tcPr>
+          <w:p>
+            <w:r/>
+            <w:r>
+              <w:rPr>
+                <w:sz w:val="18"/>
+              </w:rPr>
+              <w:t>39</w:t>
+            </w:r>
+          </w:p>
+        </w:tc>
+        <w:tc>
+          <w:tcPr>
+            <w:tcW w:type="dxa" w:w="1329"/>
+            <w:shd w:val="clear" w:color="auto" w:fill="F2F5F9"/>
+          </w:tcPr>
+          <w:p>
+            <w:r/>
+            <w:r>
+              <w:rPr>
+                <w:sz w:val="18"/>
+              </w:rPr>
+              <w:t>29%</w:t>
+            </w:r>
+          </w:p>
+        </w:tc>
+        <w:tc>
+          <w:tcPr>
+            <w:tcW w:type="dxa" w:w="5094"/>
+            <w:shd w:val="clear" w:color="auto" w:fill="F2F5F9"/>
+          </w:tcPr>
+          <w:p>
+            <w:r/>
+            <w:r>
+              <w:rPr>
+                <w:sz w:val="18"/>
+              </w:rPr>
+              <w:t>Compute (14), Networking (12), Storage (5)</w:t>
+            </w:r>
+          </w:p>
+        </w:tc>
+      </w:tr>
+      <w:tr>
+        <w:tc>
+          <w:tcPr>
+            <w:tcW w:type="dxa" w:w="1920"/>
+          </w:tcPr>
+          <w:p>
+            <w:r/>
+            <w:r>
+              <w:rPr>
+                <w:sz w:val="18"/>
+              </w:rPr>
+              <w:t>uksouth</w:t>
+            </w:r>
+          </w:p>
+        </w:tc>
+        <w:tc>
+          <w:tcPr>
+            <w:tcW w:type="dxa" w:w="1403"/>
+          </w:tcPr>
+          <w:p>
+            <w:r/>
+            <w:r>
+              <w:rPr>
+                <w:sz w:val="18"/>
+              </w:rPr>
+              <w:t>26</w:t>
+            </w:r>
+          </w:p>
+        </w:tc>
+        <w:tc>
+          <w:tcPr>
+            <w:tcW w:type="dxa" w:w="1329"/>
+          </w:tcPr>
+          <w:p>
+            <w:r/>
+            <w:r>
+              <w:rPr>
+                <w:sz w:val="18"/>
+              </w:rPr>
+              <w:t>20%</w:t>
+            </w:r>
+          </w:p>
+        </w:tc>
+        <w:tc>
+          <w:tcPr>
+            <w:tcW w:type="dxa" w:w="5094"/>
+          </w:tcPr>
+          <w:p>
+            <w:r/>
+            <w:r>
+              <w:rPr>
+                <w:sz w:val="18"/>
+              </w:rPr>
+              <w:t>Compute (15), Networking (7), Databases (2)</w:t>
+            </w:r>
+          </w:p>
+        </w:tc>
+      </w:tr>
+      <w:tr>
+        <w:tc>
+          <w:tcPr>
+            <w:tcW w:type="dxa" w:w="1920"/>
+            <w:shd w:val="clear" w:color="auto" w:fill="F2F5F9"/>
+          </w:tcPr>
+          <w:p>
+            <w:r/>
+            <w:r>
+              <w:rPr>
+                <w:sz w:val="18"/>
+              </w:rPr>
+              <w:t>centralindia</w:t>
+            </w:r>
+          </w:p>
+        </w:tc>
+        <w:tc>
+          <w:tcPr>
+            <w:tcW w:type="dxa" w:w="1403"/>
+            <w:shd w:val="clear" w:color="auto" w:fill="F2F5F9"/>
+          </w:tcPr>
+          <w:p>
+            <w:r/>
+            <w:r>
+              <w:rPr>
+                <w:sz w:val="18"/>
+              </w:rPr>
+              <w:t>8</w:t>
+            </w:r>
+          </w:p>
+        </w:tc>
+        <w:tc>
+          <w:tcPr>
+            <w:tcW w:type="dxa" w:w="1329"/>
+            <w:shd w:val="clear" w:color="auto" w:fill="F2F5F9"/>
+          </w:tcPr>
+          <w:p>
+            <w:r/>
+            <w:r>
+              <w:rPr>
+                <w:sz w:val="18"/>
+              </w:rPr>
+              <w:t>6%</w:t>
+            </w:r>
+          </w:p>
+        </w:tc>
+        <w:tc>
+          <w:tcPr>
+            <w:tcW w:type="dxa" w:w="5094"/>
+            <w:shd w:val="clear" w:color="auto" w:fill="F2F5F9"/>
+          </w:tcPr>
+          <w:p>
+            <w:r/>
+            <w:r>
+              <w:rPr>
+                <w:sz w:val="18"/>
+              </w:rPr>
+              <w:t>Compute (4), Storage (2), Networking (1)</w:t>
+            </w:r>
+          </w:p>
+        </w:tc>
+      </w:tr>
+    </w:tbl>
+    <w:p/>
+    <w:p>
+      <w:pPr>
+        <w:keepNext/>
+      </w:pPr>
+      <w:r>
+        <w:rPr>
+          <w:b/>
+        </w:rPr>
+        <w:t>Related findings</w:t>
+      </w:r>
+    </w:p>
+    <w:p>
+      <w:pPr>
+        <w:pStyle w:val="ListBullet"/>
+      </w:pPr>
+      <w:r>
+        <w:t xml:space="preserve">GOV-002 Resource outside approved regions: </w:t>
+      </w:r>
+      <w:r>
+        <w:rPr>
+          <w:b/>
+          <w:color w:val="EC835A"/>
+        </w:rPr>
+        <w:t>Medium</w:t>
+      </w:r>
+      <w:r>
+        <w:t>, 8 resources (see 5.5 Governance)</w:t>
+      </w:r>
+    </w:p>
+    <w:p>
+      <w:pPr>
+        <w:pStyle w:val="Heading2"/>
+      </w:pPr>
+      <w:r>
+        <w:t>3.4 Compute</w:t>
+      </w:r>
+    </w:p>
+    <w:p>
+      <w:r>
+        <w:t>There are 24 virtual machines across 2 subscriptions and 4 regions.</w:t>
+      </w:r>
+    </w:p>
+    <w:p>
+      <w:r>
+        <w:t>By operating system, the fleet is Linux (20) and Windows (4). It uses 6 VM sizes, mostly D-series v5 (13), E-series v5 (4) and A-series v2 (3); the most common sizes are Standard_D2s_v5 (9), Standard_E8s_v5 (4) and Standard_D4s_v5 (4).</w:t>
+      </w:r>
+    </w:p>
+    <w:p>
+      <w:r>
+        <w:t>At the time of export 19 of 24 VMs (79%) were running, 1 was deallocated and 4 were stopped but still allocated, which means their compute is still being billed.</w:t>
+      </w:r>
+    </w:p>
+    <w:p>
+      <w:r>
+        <w:t>For resilience, 9 VMs are pinned to availability zones and 0 sit in availability sets; the remaining 15 have no zone or availability-set protection and depend on a single host or datacenter.</w:t>
+      </w:r>
+    </w:p>
+    <w:p>
+      <w:r>
+        <w:t>Storage for these machines is provided by 34 managed disks totalling 4,928 GB, on Premium_LRS (31) and StandardSSD_LRS (3) tiers. Disk states are Attached (24) and Unattached (10). The 10 unattached disks (1,856 GB) are not used by any VM but are still billed.</w:t>
+      </w:r>
+    </w:p>
+    <w:p>
+      <w:pPr>
+        <w:keepNext/>
+      </w:pPr>
+      <w:r>
+        <w:rPr>
+          <w:b/>
+          <w:color w:val="52514E"/>
+          <w:sz w:val="19"/>
+        </w:rPr>
+        <w:t>Virtual machines by size</w:t>
+      </w:r>
+    </w:p>
+    <w:tbl>
+      <w:tblPr>
+        <w:tblStyle w:val="TableGrid"/>
+        <w:jc w:val="center"/>
+        <w:tblLayout w:type="fixed"/>
+        <w:tblLook w:firstColumn="1" w:firstRow="1" w:lastColumn="0" w:lastRow="0" w:noHBand="0" w:noVBand="1" w:val="04A0"/>
+        <w:tblW w:w="9746" w:type="dxa"/>
+      </w:tblPr>
+      <w:tblGrid>
+        <w:gridCol w:w="4103"/>
+        <w:gridCol w:w="4103"/>
+        <w:gridCol w:w="1538"/>
+      </w:tblGrid>
+      <w:tr>
+        <w:trPr>
+          <w:tblHeader w:val="true"/>
+        </w:trPr>
+        <w:tc>
+          <w:tcPr>
+            <w:tcW w:type="dxa" w:w="4104"/>
+            <w:shd w:val="clear" w:color="auto" w:fill="0F3B68"/>
+          </w:tcPr>
+          <w:p>
+            <w:r/>
+            <w:r>
+              <w:rPr>
+                <w:b/>
+                <w:color w:val="FFFFFF"/>
+                <w:sz w:val="18"/>
+              </w:rPr>
+              <w:t>VM size</w:t>
+            </w:r>
+          </w:p>
+        </w:tc>
+        <w:tc>
+          <w:tcPr>
+            <w:tcW w:type="dxa" w:w="4104"/>
+            <w:shd w:val="clear" w:color="auto" w:fill="0F3B68"/>
+          </w:tcPr>
+          <w:p>
+            <w:r/>
+            <w:r>
+              <w:rPr>
+                <w:b/>
+                <w:color w:val="FFFFFF"/>
+                <w:sz w:val="18"/>
+              </w:rPr>
+              <w:t>Series</w:t>
+            </w:r>
+          </w:p>
+        </w:tc>
+        <w:tc>
+          <w:tcPr>
+            <w:tcW w:type="dxa" w:w="1539"/>
+            <w:shd w:val="clear" w:color="auto" w:fill="0F3B68"/>
+          </w:tcPr>
+          <w:p>
+            <w:r/>
+            <w:r>
+              <w:rPr>
+                <w:b/>
+                <w:color w:val="FFFFFF"/>
+                <w:sz w:val="18"/>
+              </w:rPr>
+              <w:t>Count</w:t>
+            </w:r>
+          </w:p>
+        </w:tc>
+      </w:tr>
+      <w:tr>
+        <w:tc>
+          <w:tcPr>
+            <w:tcW w:type="dxa" w:w="4104"/>
+          </w:tcPr>
+          <w:p>
+            <w:r/>
+            <w:r>
+              <w:rPr>
+                <w:sz w:val="18"/>
+              </w:rPr>
+              <w:t>Standard_D2s_v5</w:t>
+            </w:r>
+          </w:p>
+        </w:tc>
+        <w:tc>
+          <w:tcPr>
+            <w:tcW w:type="dxa" w:w="4104"/>
+          </w:tcPr>
+          <w:p>
+            <w:r/>
+            <w:r>
+              <w:rPr>
+                <w:sz w:val="18"/>
+              </w:rPr>
+              <w:t>D-series v5</w:t>
+            </w:r>
+          </w:p>
+        </w:tc>
+        <w:tc>
+          <w:tcPr>
+            <w:tcW w:type="dxa" w:w="1539"/>
+          </w:tcPr>
+          <w:p>
+            <w:r/>
+            <w:r>
+              <w:rPr>
+                <w:sz w:val="18"/>
+              </w:rPr>
+              <w:t>9</w:t>
+            </w:r>
+          </w:p>
+        </w:tc>
+      </w:tr>
+      <w:tr>
+        <w:tc>
+          <w:tcPr>
+            <w:tcW w:type="dxa" w:w="4104"/>
+            <w:shd w:val="clear" w:color="auto" w:fill="F2F5F9"/>
+          </w:tcPr>
+          <w:p>
+            <w:r/>
+            <w:r>
+              <w:rPr>
+                <w:sz w:val="18"/>
+              </w:rPr>
+              <w:t>Standard_E8s_v5</w:t>
+            </w:r>
+          </w:p>
+        </w:tc>
+        <w:tc>
+          <w:tcPr>
+            <w:tcW w:type="dxa" w:w="4104"/>
+            <w:shd w:val="clear" w:color="auto" w:fill="F2F5F9"/>
+          </w:tcPr>
+          <w:p>
+            <w:r/>
+            <w:r>
+              <w:rPr>
+                <w:sz w:val="18"/>
+              </w:rPr>
+              <w:t>E-series v5</w:t>
+            </w:r>
+          </w:p>
+        </w:tc>
+        <w:tc>
+          <w:tcPr>
+            <w:tcW w:type="dxa" w:w="1539"/>
+            <w:shd w:val="clear" w:color="auto" w:fill="F2F5F9"/>
+          </w:tcPr>
+          <w:p>
+            <w:r/>
+            <w:r>
+              <w:rPr>
+                <w:sz w:val="18"/>
+              </w:rPr>
+              <w:t>4</w:t>
+            </w:r>
+          </w:p>
+        </w:tc>
+      </w:tr>
+      <w:tr>
+        <w:tc>
+          <w:tcPr>
+            <w:tcW w:type="dxa" w:w="4104"/>
+          </w:tcPr>
+          <w:p>
+            <w:r/>
+            <w:r>
+              <w:rPr>
+                <w:sz w:val="18"/>
+              </w:rPr>
+              <w:t>Standard_D4s_v5</w:t>
+            </w:r>
+          </w:p>
+        </w:tc>
+        <w:tc>
+          <w:tcPr>
+            <w:tcW w:type="dxa" w:w="4104"/>
+          </w:tcPr>
+          <w:p>
+            <w:r/>
+            <w:r>
+              <w:rPr>
+                <w:sz w:val="18"/>
+              </w:rPr>
+              <w:t>D-series v5</w:t>
+            </w:r>
+          </w:p>
+        </w:tc>
+        <w:tc>
+          <w:tcPr>
+            <w:tcW w:type="dxa" w:w="1539"/>
+          </w:tcPr>
+          <w:p>
+            <w:r/>
+            <w:r>
+              <w:rPr>
+                <w:sz w:val="18"/>
+              </w:rPr>
+              <w:t>4</w:t>
+            </w:r>
+          </w:p>
+        </w:tc>
+      </w:tr>
+      <w:tr>
+        <w:tc>
+          <w:tcPr>
+            <w:tcW w:type="dxa" w:w="4104"/>
+            <w:shd w:val="clear" w:color="auto" w:fill="F2F5F9"/>
+          </w:tcPr>
+          <w:p>
+            <w:r/>
+            <w:r>
+              <w:rPr>
+                <w:sz w:val="18"/>
+              </w:rPr>
+              <w:t>Standard_A2_v2</w:t>
+            </w:r>
+          </w:p>
+        </w:tc>
+        <w:tc>
+          <w:tcPr>
+            <w:tcW w:type="dxa" w:w="4104"/>
+            <w:shd w:val="clear" w:color="auto" w:fill="F2F5F9"/>
+          </w:tcPr>
+          <w:p>
+            <w:r/>
+            <w:r>
+              <w:rPr>
+                <w:sz w:val="18"/>
+              </w:rPr>
+              <w:t>A-series v2</w:t>
+            </w:r>
+          </w:p>
+        </w:tc>
+        <w:tc>
+          <w:tcPr>
+            <w:tcW w:type="dxa" w:w="1539"/>
+            <w:shd w:val="clear" w:color="auto" w:fill="F2F5F9"/>
+          </w:tcPr>
+          <w:p>
+            <w:r/>
+            <w:r>
+              <w:rPr>
+                <w:sz w:val="18"/>
+              </w:rPr>
+              <w:t>3</w:t>
+            </w:r>
+          </w:p>
+        </w:tc>
+      </w:tr>
+      <w:tr>
+        <w:tc>
+          <w:tcPr>
+            <w:tcW w:type="dxa" w:w="4104"/>
+          </w:tcPr>
+          <w:p>
+            <w:r/>
+            <w:r>
+              <w:rPr>
+                <w:sz w:val="18"/>
+              </w:rPr>
+              <w:t>Standard_DS2_v2</w:t>
+            </w:r>
+          </w:p>
+        </w:tc>
+        <w:tc>
+          <w:tcPr>
+            <w:tcW w:type="dxa" w:w="4104"/>
+          </w:tcPr>
+          <w:p>
+            <w:r/>
+            <w:r>
+              <w:rPr>
+                <w:sz w:val="18"/>
+              </w:rPr>
+              <w:t>DS-series v2</w:t>
+            </w:r>
+          </w:p>
+        </w:tc>
+        <w:tc>
+          <w:tcPr>
+            <w:tcW w:type="dxa" w:w="1539"/>
+          </w:tcPr>
+          <w:p>
+            <w:r/>
+            <w:r>
+              <w:rPr>
+                <w:sz w:val="18"/>
+              </w:rPr>
+              <w:t>2</w:t>
+            </w:r>
+          </w:p>
+        </w:tc>
+      </w:tr>
+      <w:tr>
+        <w:tc>
+          <w:tcPr>
+            <w:tcW w:type="dxa" w:w="4104"/>
+            <w:shd w:val="clear" w:color="auto" w:fill="F2F5F9"/>
+          </w:tcPr>
+          <w:p>
+            <w:r/>
+            <w:r>
+              <w:rPr>
+                <w:sz w:val="18"/>
+              </w:rPr>
+              <w:t>Standard_B2ms</w:t>
+            </w:r>
+          </w:p>
+        </w:tc>
+        <w:tc>
+          <w:tcPr>
+            <w:tcW w:type="dxa" w:w="4104"/>
+            <w:shd w:val="clear" w:color="auto" w:fill="F2F5F9"/>
+          </w:tcPr>
+          <w:p>
+            <w:r/>
+            <w:r>
+              <w:rPr>
+                <w:sz w:val="18"/>
+              </w:rPr>
+              <w:t>B-series</w:t>
+            </w:r>
+          </w:p>
+        </w:tc>
+        <w:tc>
+          <w:tcPr>
+            <w:tcW w:type="dxa" w:w="1539"/>
+            <w:shd w:val="clear" w:color="auto" w:fill="F2F5F9"/>
+          </w:tcPr>
+          <w:p>
+            <w:r/>
+            <w:r>
+              <w:rPr>
+                <w:sz w:val="18"/>
+              </w:rPr>
+              <w:t>2</w:t>
+            </w:r>
+          </w:p>
+        </w:tc>
+      </w:tr>
+    </w:tbl>
+    <w:p/>
+    <w:p>
+      <w:pPr>
+        <w:keepNext/>
+      </w:pPr>
+      <w:r>
+        <w:rPr>
+          <w:b/>
+        </w:rPr>
+        <w:t>Related findings</w:t>
+      </w:r>
+    </w:p>
+    <w:p>
+      <w:pPr>
+        <w:pStyle w:val="ListBullet"/>
+      </w:pPr>
+      <w:r>
+        <w:t xml:space="preserve">REL-001 VM has no zone or availability set: </w:t>
+      </w:r>
+      <w:r>
+        <w:rPr>
+          <w:b/>
+          <w:color w:val="EC835A"/>
+        </w:rPr>
+        <w:t>Medium</w:t>
+      </w:r>
+      <w:r>
+        <w:t>, 15 resources (see 5.2 Reliability)</w:t>
+      </w:r>
+    </w:p>
+    <w:p>
+      <w:pPr>
+        <w:pStyle w:val="ListBullet"/>
+      </w:pPr>
+      <w:r>
+        <w:t xml:space="preserve">COST-003 VM stopped but not deallocated: </w:t>
+      </w:r>
+      <w:r>
+        <w:rPr>
+          <w:b/>
+          <w:color w:val="D03B3B"/>
+        </w:rPr>
+        <w:t>High</w:t>
+      </w:r>
+      <w:r>
+        <w:t>, 4 resources (see 5.3 Cost Optimization)</w:t>
+      </w:r>
+    </w:p>
+    <w:p>
+      <w:pPr>
+        <w:pStyle w:val="ListBullet"/>
+      </w:pPr>
+      <w:r>
+        <w:t xml:space="preserve">COST-004 Deallocated VM: </w:t>
+      </w:r>
+      <w:r>
+        <w:rPr>
+          <w:b/>
+          <w:color w:val="9A6700"/>
+        </w:rPr>
+        <w:t>Low</w:t>
+      </w:r>
+      <w:r>
+        <w:t>, 1 resource (see 5.3 Cost Optimization)</w:t>
+      </w:r>
+    </w:p>
+    <w:p>
+      <w:pPr>
+        <w:pStyle w:val="ListBullet"/>
+      </w:pPr>
+      <w:r>
+        <w:t xml:space="preserve">COST-001 Unattached managed disk: </w:t>
+      </w:r>
+      <w:r>
+        <w:rPr>
+          <w:b/>
+          <w:color w:val="EC835A"/>
+        </w:rPr>
+        <w:t>Medium</w:t>
+      </w:r>
+      <w:r>
+        <w:t>, 10 resources (see 5.3 Cost Optimization)</w:t>
+      </w:r>
+    </w:p>
+    <w:p>
+      <w:pPr>
+        <w:pStyle w:val="ListBullet"/>
+      </w:pPr>
+      <w:r>
+        <w:t xml:space="preserve">OPS-001 Previous-generation VM size: </w:t>
+      </w:r>
+      <w:r>
+        <w:rPr>
+          <w:b/>
+          <w:color w:val="9A6700"/>
+        </w:rPr>
+        <w:t>Low</w:t>
+      </w:r>
+      <w:r>
+        <w:t>, 5 resources (see 5.4 Operational Excellence)</w:t>
+      </w:r>
+    </w:p>
+    <w:p>
+      <w:pPr>
+        <w:pStyle w:val="Heading2"/>
+      </w:pPr>
+      <w:r>
+        <w:t>3.5 Networking</w:t>
+      </w:r>
+    </w:p>
+    <w:p>
+      <w:r>
+        <w:t>The network layer consists of 38 resources: Network interfaces (24), Public IP addresses (6), Network security groups (4), Virtual networks (2) and Azure Firewalls (2).</w:t>
+      </w:r>
+    </w:p>
+    <w:p>
+      <w:r>
+        <w:t>There are 2 virtual networks in eastus and westeurope. The naming (vnet-hub-eastus and vnet-hub-westeurope) and the Azure Firewall deployment (afw-hub-eastus and afw-hub-westeurope) indicate a hub-and-spoke design, where shared connectivity and traffic inspection are centralised in a hub network.</w:t>
+      </w:r>
+    </w:p>
+    <w:p>
+      <w:r>
+        <w:t>Traffic filtering uses 4 network security groups with 6 custom rules between them. Some NSGs allow RDP or SSH from the Internet (see related findings).</w:t>
+      </w:r>
+    </w:p>
+    <w:p>
+      <w:r>
+        <w:t>6 public IP addresses are allocated; 2 of them are not associated with any resource.</w:t>
+      </w:r>
+    </w:p>
+    <w:p>
+      <w:pPr>
+        <w:keepNext/>
+      </w:pPr>
+      <w:r>
+        <w:rPr>
+          <w:b/>
+          <w:color w:val="52514E"/>
+          <w:sz w:val="19"/>
+        </w:rPr>
+        <w:t>Network resources</w:t>
+      </w:r>
+    </w:p>
+    <w:tbl>
+      <w:tblPr>
+        <w:tblStyle w:val="TableGrid"/>
+        <w:jc w:val="center"/>
+        <w:tblLayout w:type="fixed"/>
+        <w:tblLook w:firstColumn="1" w:firstRow="1" w:lastColumn="0" w:lastRow="0" w:noHBand="0" w:noVBand="1" w:val="04A0"/>
+        <w:tblW w:w="9746" w:type="dxa"/>
+      </w:tblPr>
+      <w:tblGrid>
+        <w:gridCol w:w="3898"/>
+        <w:gridCol w:w="1169"/>
+        <w:gridCol w:w="4678"/>
+      </w:tblGrid>
+      <w:tr>
+        <w:trPr>
+          <w:tblHeader w:val="true"/>
+        </w:trPr>
+        <w:tc>
+          <w:tcPr>
+            <w:tcW w:type="dxa" w:w="3898"/>
+            <w:shd w:val="clear" w:color="auto" w:fill="0F3B68"/>
+          </w:tcPr>
+          <w:p>
+            <w:r/>
+            <w:r>
+              <w:rPr>
+                <w:b/>
+                <w:color w:val="FFFFFF"/>
+                <w:sz w:val="18"/>
+              </w:rPr>
+              <w:t>Resource type</w:t>
+            </w:r>
+          </w:p>
+        </w:tc>
+        <w:tc>
+          <w:tcPr>
+            <w:tcW w:type="dxa" w:w="1170"/>
+            <w:shd w:val="clear" w:color="auto" w:fill="0F3B68"/>
+          </w:tcPr>
+          <w:p>
+            <w:r/>
+            <w:r>
+              <w:rPr>
+                <w:b/>
+                <w:color w:val="FFFFFF"/>
+                <w:sz w:val="18"/>
+              </w:rPr>
+              <w:t>Count</w:t>
+            </w:r>
+          </w:p>
+        </w:tc>
+        <w:tc>
+          <w:tcPr>
+            <w:tcW w:type="dxa" w:w="4678"/>
+            <w:shd w:val="clear" w:color="auto" w:fill="0F3B68"/>
+          </w:tcPr>
+          <w:p>
+            <w:r/>
+            <w:r>
+              <w:rPr>
+                <w:b/>
+                <w:color w:val="FFFFFF"/>
+                <w:sz w:val="18"/>
+              </w:rPr>
+              <w:t>Regions</w:t>
+            </w:r>
+          </w:p>
+        </w:tc>
+      </w:tr>
+      <w:tr>
+        <w:tc>
+          <w:tcPr>
+            <w:tcW w:type="dxa" w:w="3898"/>
+          </w:tcPr>
+          <w:p>
+            <w:r/>
+            <w:r>
+              <w:rPr>
+                <w:sz w:val="18"/>
+              </w:rPr>
+              <w:t>Network interfaces</w:t>
+            </w:r>
+          </w:p>
+        </w:tc>
+        <w:tc>
+          <w:tcPr>
+            <w:tcW w:type="dxa" w:w="1170"/>
+          </w:tcPr>
+          <w:p>
+            <w:r/>
+            <w:r>
+              <w:rPr>
+                <w:sz w:val="18"/>
+              </w:rPr>
+              <w:t>24</w:t>
+            </w:r>
+          </w:p>
+        </w:tc>
+        <w:tc>
+          <w:tcPr>
+            <w:tcW w:type="dxa" w:w="4678"/>
+          </w:tcPr>
+          <w:p>
+            <w:r/>
+            <w:r>
+              <w:rPr>
+                <w:sz w:val="18"/>
+              </w:rPr>
+              <w:t>centralindia, eastus, uksouth, westeurope</w:t>
+            </w:r>
+          </w:p>
+        </w:tc>
+      </w:tr>
+      <w:tr>
+        <w:tc>
+          <w:tcPr>
+            <w:tcW w:type="dxa" w:w="3898"/>
+            <w:shd w:val="clear" w:color="auto" w:fill="F2F5F9"/>
+          </w:tcPr>
+          <w:p>
+            <w:r/>
+            <w:r>
+              <w:rPr>
+                <w:sz w:val="18"/>
+              </w:rPr>
+              <w:t>Public IP addresses</w:t>
+            </w:r>
+          </w:p>
+        </w:tc>
+        <w:tc>
+          <w:tcPr>
+            <w:tcW w:type="dxa" w:w="1170"/>
+            <w:shd w:val="clear" w:color="auto" w:fill="F2F5F9"/>
+          </w:tcPr>
+          <w:p>
+            <w:r/>
+            <w:r>
+              <w:rPr>
+                <w:sz w:val="18"/>
+              </w:rPr>
+              <w:t>6</w:t>
+            </w:r>
+          </w:p>
+        </w:tc>
+        <w:tc>
+          <w:tcPr>
+            <w:tcW w:type="dxa" w:w="4678"/>
+            <w:shd w:val="clear" w:color="auto" w:fill="F2F5F9"/>
+          </w:tcPr>
+          <w:p>
+            <w:r/>
+            <w:r>
+              <w:rPr>
+                <w:sz w:val="18"/>
+              </w:rPr>
+              <w:t>eastus, westeurope</w:t>
+            </w:r>
+          </w:p>
+        </w:tc>
+      </w:tr>
+      <w:tr>
+        <w:tc>
+          <w:tcPr>
+            <w:tcW w:type="dxa" w:w="3898"/>
+          </w:tcPr>
+          <w:p>
+            <w:r/>
+            <w:r>
+              <w:rPr>
+                <w:sz w:val="18"/>
+              </w:rPr>
+              <w:t>Network security groups</w:t>
+            </w:r>
+          </w:p>
+        </w:tc>
+        <w:tc>
+          <w:tcPr>
+            <w:tcW w:type="dxa" w:w="1170"/>
+          </w:tcPr>
+          <w:p>
+            <w:r/>
+            <w:r>
+              <w:rPr>
+                <w:sz w:val="18"/>
+              </w:rPr>
+              <w:t>4</w:t>
+            </w:r>
+          </w:p>
+        </w:tc>
+        <w:tc>
+          <w:tcPr>
+            <w:tcW w:type="dxa" w:w="4678"/>
+          </w:tcPr>
+          <w:p>
+            <w:r/>
+            <w:r>
+              <w:rPr>
+                <w:sz w:val="18"/>
+              </w:rPr>
+              <w:t>eastus, westeurope</w:t>
+            </w:r>
+          </w:p>
+        </w:tc>
+      </w:tr>
+      <w:tr>
+        <w:tc>
+          <w:tcPr>
+            <w:tcW w:type="dxa" w:w="3898"/>
+            <w:shd w:val="clear" w:color="auto" w:fill="F2F5F9"/>
+          </w:tcPr>
+          <w:p>
+            <w:r/>
+            <w:r>
+              <w:rPr>
+                <w:sz w:val="18"/>
+              </w:rPr>
+              <w:t>Virtual networks</w:t>
+            </w:r>
+          </w:p>
+        </w:tc>
+        <w:tc>
+          <w:tcPr>
+            <w:tcW w:type="dxa" w:w="1170"/>
+            <w:shd w:val="clear" w:color="auto" w:fill="F2F5F9"/>
+          </w:tcPr>
+          <w:p>
+            <w:r/>
+            <w:r>
+              <w:rPr>
+                <w:sz w:val="18"/>
+              </w:rPr>
+              <w:t>2</w:t>
+            </w:r>
+          </w:p>
+        </w:tc>
+        <w:tc>
+          <w:tcPr>
+            <w:tcW w:type="dxa" w:w="4678"/>
+            <w:shd w:val="clear" w:color="auto" w:fill="F2F5F9"/>
+          </w:tcPr>
+          <w:p>
+            <w:r/>
+            <w:r>
+              <w:rPr>
+                <w:sz w:val="18"/>
+              </w:rPr>
+              <w:t>eastus, westeurope</w:t>
+            </w:r>
+          </w:p>
+        </w:tc>
+      </w:tr>
+      <w:tr>
+        <w:tc>
+          <w:tcPr>
+            <w:tcW w:type="dxa" w:w="3898"/>
+          </w:tcPr>
+          <w:p>
+            <w:r/>
+            <w:r>
+              <w:rPr>
+                <w:sz w:val="18"/>
+              </w:rPr>
+              <w:t>Azure Firewalls</w:t>
+            </w:r>
+          </w:p>
+        </w:tc>
+        <w:tc>
+          <w:tcPr>
+            <w:tcW w:type="dxa" w:w="1170"/>
+          </w:tcPr>
+          <w:p>
+            <w:r/>
+            <w:r>
+              <w:rPr>
+                <w:sz w:val="18"/>
+              </w:rPr>
+              <w:t>2</w:t>
+            </w:r>
+          </w:p>
+        </w:tc>
+        <w:tc>
+          <w:tcPr>
+            <w:tcW w:type="dxa" w:w="4678"/>
+          </w:tcPr>
+          <w:p>
+            <w:r/>
+            <w:r>
+              <w:rPr>
+                <w:sz w:val="18"/>
+              </w:rPr>
+              <w:t>eastus, westeurope</w:t>
+            </w:r>
+          </w:p>
+        </w:tc>
+      </w:tr>
+    </w:tbl>
+    <w:p/>
+    <w:p>
+      <w:pPr>
+        <w:keepNext/>
+      </w:pPr>
+      <w:r>
+        <w:rPr>
+          <w:b/>
+        </w:rPr>
+        <w:t>Related findings</w:t>
+      </w:r>
+    </w:p>
+    <w:p>
+      <w:pPr>
+        <w:pStyle w:val="ListBullet"/>
+      </w:pPr>
+      <w:r>
+        <w:t xml:space="preserve">SEC-007 NSG exposes management ports to the Internet: </w:t>
+      </w:r>
+      <w:r>
+        <w:rPr>
+          <w:b/>
+          <w:color w:val="D03B3B"/>
+        </w:rPr>
+        <w:t>High</w:t>
+      </w:r>
+      <w:r>
+        <w:t>, 2 resources (see 5.1 Security)</w:t>
+      </w:r>
+    </w:p>
+    <w:p>
+      <w:pPr>
+        <w:pStyle w:val="ListBullet"/>
+      </w:pPr>
+      <w:r>
+        <w:t xml:space="preserve">COST-002 Unassociated public IP address: </w:t>
+      </w:r>
+      <w:r>
+        <w:rPr>
+          <w:b/>
+          <w:color w:val="9A6700"/>
+        </w:rPr>
+        <w:t>Low</w:t>
+      </w:r>
+      <w:r>
+        <w:t>, 2 resources (see 5.3 Cost Optimization)</w:t>
+      </w:r>
+    </w:p>
+    <w:p>
+      <w:pPr>
+        <w:pStyle w:val="Heading2"/>
+      </w:pPr>
+      <w:r>
+        <w:t>3.6 Storage</w:t>
+      </w:r>
+    </w:p>
+    <w:p>
+      <w:r>
+        <w:t>There are 10 storage accounts, all of kind StorageV2. Replication is GRS for 4, LRS for 3 and ZRS for 3. LRS keeps copies within one datacenter only; ZRS spreads them across zones and GRS/GZRS add a copy in a paired region.</w:t>
+      </w:r>
+    </w:p>
+    <w:p>
+      <w:r>
+        <w:t>On security settings, 6 of 10 accounts require HTTPS, 8 enforce TLS 1.2 or later, 4 allow anonymous blob access, and 10 accept traffic from public networks.</w:t>
+      </w:r>
+    </w:p>
+    <w:p>
+      <w:pPr>
+        <w:keepNext/>
+      </w:pPr>
+      <w:r>
+        <w:rPr>
+          <w:b/>
+          <w:color w:val="52514E"/>
+          <w:sz w:val="19"/>
+        </w:rPr>
+        <w:t>Storage accounts</w:t>
+      </w:r>
+    </w:p>
+    <w:tbl>
+      <w:tblPr>
+        <w:tblStyle w:val="TableGrid"/>
+        <w:jc w:val="center"/>
+        <w:tblLayout w:type="fixed"/>
+        <w:tblLook w:firstColumn="1" w:firstRow="1" w:lastColumn="0" w:lastRow="0" w:noHBand="0" w:noVBand="1" w:val="04A0"/>
+        <w:tblW w:w="9746" w:type="dxa"/>
+      </w:tblPr>
+      <w:tblGrid>
+        <w:gridCol w:w="2030"/>
+        <w:gridCol w:w="2301"/>
+        <w:gridCol w:w="1624"/>
+        <w:gridCol w:w="1082"/>
+        <w:gridCol w:w="1082"/>
+        <w:gridCol w:w="1624"/>
+      </w:tblGrid>
+      <w:tr>
+        <w:trPr>
+          <w:tblHeader w:val="true"/>
+        </w:trPr>
+        <w:tc>
+          <w:tcPr>
+            <w:tcW w:type="dxa" w:w="2030"/>
+            <w:shd w:val="clear" w:color="auto" w:fill="0F3B68"/>
+          </w:tcPr>
+          <w:p>
+            <w:r/>
+            <w:r>
+              <w:rPr>
+                <w:b/>
+                <w:color w:val="FFFFFF"/>
+                <w:sz w:val="18"/>
+              </w:rPr>
+              <w:t>Account</w:t>
+            </w:r>
+          </w:p>
+        </w:tc>
+        <w:tc>
+          <w:tcPr>
+            <w:tcW w:type="dxa" w:w="2301"/>
+            <w:shd w:val="clear" w:color="auto" w:fill="0F3B68"/>
+          </w:tcPr>
+          <w:p>
+            <w:r/>
+            <w:r>
+              <w:rPr>
+                <w:b/>
+                <w:color w:val="FFFFFF"/>
+                <w:sz w:val="18"/>
+              </w:rPr>
+              <w:t>Subscription</w:t>
+            </w:r>
+          </w:p>
+        </w:tc>
+        <w:tc>
+          <w:tcPr>
+            <w:tcW w:type="dxa" w:w="1624"/>
+            <w:shd w:val="clear" w:color="auto" w:fill="0F3B68"/>
+          </w:tcPr>
+          <w:p>
+            <w:r/>
+            <w:r>
+              <w:rPr>
+                <w:b/>
+                <w:color w:val="FFFFFF"/>
+                <w:sz w:val="18"/>
+              </w:rPr>
+              <w:t>Replication</w:t>
+            </w:r>
+          </w:p>
+        </w:tc>
+        <w:tc>
+          <w:tcPr>
+            <w:tcW w:type="dxa" w:w="1083"/>
+            <w:shd w:val="clear" w:color="auto" w:fill="0F3B68"/>
+          </w:tcPr>
+          <w:p>
+            <w:r/>
+            <w:r>
+              <w:rPr>
+                <w:b/>
+                <w:color w:val="FFFFFF"/>
+                <w:sz w:val="18"/>
+              </w:rPr>
+              <w:t>HTTPS only</w:t>
+            </w:r>
+          </w:p>
+        </w:tc>
+        <w:tc>
+          <w:tcPr>
+            <w:tcW w:type="dxa" w:w="1083"/>
+            <w:shd w:val="clear" w:color="auto" w:fill="0F3B68"/>
+          </w:tcPr>
+          <w:p>
+            <w:r/>
+            <w:r>
+              <w:rPr>
+                <w:b/>
+                <w:color w:val="FFFFFF"/>
+                <w:sz w:val="18"/>
+              </w:rPr>
+              <w:t>Min TLS</w:t>
+            </w:r>
+          </w:p>
+        </w:tc>
+        <w:tc>
+          <w:tcPr>
+            <w:tcW w:type="dxa" w:w="1624"/>
+            <w:shd w:val="clear" w:color="auto" w:fill="0F3B68"/>
+          </w:tcPr>
+          <w:p>
+            <w:r/>
+            <w:r>
+              <w:rPr>
+                <w:b/>
+                <w:color w:val="FFFFFF"/>
+                <w:sz w:val="18"/>
+              </w:rPr>
+              <w:t>Anonymous blob access</w:t>
+            </w:r>
+          </w:p>
+        </w:tc>
+      </w:tr>
+      <w:tr>
+        <w:tc>
+          <w:tcPr>
+            <w:tcW w:type="dxa" w:w="2030"/>
+          </w:tcPr>
+          <w:p>
+            <w:r/>
+            <w:r>
+              <w:rPr>
+                <w:sz w:val="18"/>
+              </w:rPr>
+              <w:t>stdevdata00</w:t>
+            </w:r>
+          </w:p>
+        </w:tc>
+        <w:tc>
+          <w:tcPr>
+            <w:tcW w:type="dxa" w:w="2301"/>
+          </w:tcPr>
+          <w:p>
+            <w:r/>
+            <w:r>
+              <w:rPr>
+                <w:sz w:val="18"/>
+              </w:rPr>
+              <w:t>Contoso-NonProduction</w:t>
+            </w:r>
+          </w:p>
+        </w:tc>
+        <w:tc>
+          <w:tcPr>
+            <w:tcW w:type="dxa" w:w="1624"/>
+          </w:tcPr>
+          <w:p>
+            <w:r/>
+            <w:r>
+              <w:rPr>
+                <w:sz w:val="18"/>
+              </w:rPr>
+              <w:t>Standard_GRS</w:t>
+            </w:r>
+          </w:p>
+        </w:tc>
+        <w:tc>
+          <w:tcPr>
+            <w:tcW w:type="dxa" w:w="1083"/>
+          </w:tcPr>
+          <w:p>
+            <w:r/>
+            <w:r>
+              <w:rPr>
+                <w:sz w:val="18"/>
+              </w:rPr>
+              <w:t>Yes</w:t>
+            </w:r>
+          </w:p>
+        </w:tc>
+        <w:tc>
+          <w:tcPr>
+            <w:tcW w:type="dxa" w:w="1083"/>
+          </w:tcPr>
+          <w:p>
+            <w:r/>
+            <w:r>
+              <w:rPr>
+                <w:sz w:val="18"/>
+              </w:rPr>
+              <w:t>TLS1_2</w:t>
+            </w:r>
+          </w:p>
+        </w:tc>
+        <w:tc>
+          <w:tcPr>
+            <w:tcW w:type="dxa" w:w="1624"/>
+          </w:tcPr>
+          <w:p>
+            <w:r/>
+            <w:r>
+              <w:rPr>
+                <w:sz w:val="18"/>
+              </w:rPr>
+              <w:t>Allowed</w:t>
+            </w:r>
+          </w:p>
+        </w:tc>
+      </w:tr>
+      <w:tr>
+        <w:tc>
+          <w:tcPr>
+            <w:tcW w:type="dxa" w:w="2030"/>
+            <w:shd w:val="clear" w:color="auto" w:fill="F2F5F9"/>
+          </w:tcPr>
+          <w:p>
+            <w:r/>
+            <w:r>
+              <w:rPr>
+                <w:sz w:val="18"/>
+              </w:rPr>
+              <w:t>stdevdata01</w:t>
+            </w:r>
+          </w:p>
+        </w:tc>
+        <w:tc>
+          <w:tcPr>
+            <w:tcW w:type="dxa" w:w="2301"/>
+            <w:shd w:val="clear" w:color="auto" w:fill="F2F5F9"/>
+          </w:tcPr>
+          <w:p>
+            <w:r/>
+            <w:r>
+              <w:rPr>
+                <w:sz w:val="18"/>
+              </w:rPr>
+              <w:t>Contoso-NonProduction</w:t>
+            </w:r>
+          </w:p>
+        </w:tc>
+        <w:tc>
+          <w:tcPr>
+            <w:tcW w:type="dxa" w:w="1624"/>
+            <w:shd w:val="clear" w:color="auto" w:fill="F2F5F9"/>
+          </w:tcPr>
+          <w:p>
+            <w:r/>
+            <w:r>
+              <w:rPr>
+                <w:sz w:val="18"/>
+              </w:rPr>
+              <w:t>Standard_GRS</w:t>
+            </w:r>
+          </w:p>
+        </w:tc>
+        <w:tc>
+          <w:tcPr>
+            <w:tcW w:type="dxa" w:w="1083"/>
+            <w:shd w:val="clear" w:color="auto" w:fill="F2F5F9"/>
+          </w:tcPr>
+          <w:p>
+            <w:r/>
+            <w:r>
+              <w:rPr>
+                <w:sz w:val="18"/>
+              </w:rPr>
+              <w:t>No</w:t>
+            </w:r>
+          </w:p>
+        </w:tc>
+        <w:tc>
+          <w:tcPr>
+            <w:tcW w:type="dxa" w:w="1083"/>
+            <w:shd w:val="clear" w:color="auto" w:fill="F2F5F9"/>
+          </w:tcPr>
+          <w:p>
+            <w:r/>
+            <w:r>
+              <w:rPr>
+                <w:sz w:val="18"/>
+              </w:rPr>
+              <w:t>TLS1_2</w:t>
+            </w:r>
+          </w:p>
+        </w:tc>
+        <w:tc>
+          <w:tcPr>
+            <w:tcW w:type="dxa" w:w="1624"/>
+            <w:shd w:val="clear" w:color="auto" w:fill="F2F5F9"/>
+          </w:tcPr>
+          <w:p>
+            <w:r/>
+            <w:r>
+              <w:rPr>
+                <w:sz w:val="18"/>
+              </w:rPr>
+              <w:t>Allowed</w:t>
+            </w:r>
+          </w:p>
+        </w:tc>
+      </w:tr>
+      <w:tr>
+        <w:tc>
+          <w:tcPr>
+            <w:tcW w:type="dxa" w:w="2030"/>
+          </w:tcPr>
+          <w:p>
+            <w:r/>
+            <w:r>
+              <w:rPr>
+                <w:sz w:val="18"/>
+              </w:rPr>
+              <w:t>stdevdata02</w:t>
+            </w:r>
+          </w:p>
+        </w:tc>
+        <w:tc>
+          <w:tcPr>
+            <w:tcW w:type="dxa" w:w="2301"/>
+          </w:tcPr>
+          <w:p>
+            <w:r/>
+            <w:r>
+              <w:rPr>
+                <w:sz w:val="18"/>
+              </w:rPr>
+              <w:t>Contoso-NonProduction</w:t>
+            </w:r>
+          </w:p>
+        </w:tc>
+        <w:tc>
+          <w:tcPr>
+            <w:tcW w:type="dxa" w:w="1624"/>
+          </w:tcPr>
+          <w:p>
+            <w:r/>
+            <w:r>
+              <w:rPr>
+                <w:sz w:val="18"/>
+              </w:rPr>
+              <w:t>Standard_LRS</w:t>
+            </w:r>
+          </w:p>
+        </w:tc>
+        <w:tc>
+          <w:tcPr>
+            <w:tcW w:type="dxa" w:w="1083"/>
+          </w:tcPr>
+          <w:p>
+            <w:r/>
+            <w:r>
+              <w:rPr>
+                <w:sz w:val="18"/>
+              </w:rPr>
+              <w:t>Yes</w:t>
+            </w:r>
+          </w:p>
+        </w:tc>
+        <w:tc>
+          <w:tcPr>
+            <w:tcW w:type="dxa" w:w="1083"/>
+          </w:tcPr>
+          <w:p>
+            <w:r/>
+            <w:r>
+              <w:rPr>
+                <w:sz w:val="18"/>
+              </w:rPr>
+              <w:t>TLS1_0</w:t>
+            </w:r>
+          </w:p>
+        </w:tc>
+        <w:tc>
+          <w:tcPr>
+            <w:tcW w:type="dxa" w:w="1624"/>
+          </w:tcPr>
+          <w:p>
+            <w:r/>
+            <w:r>
+              <w:rPr>
+                <w:sz w:val="18"/>
+              </w:rPr>
+              <w:t>Blocked</w:t>
+            </w:r>
+          </w:p>
+        </w:tc>
+      </w:tr>
+      <w:tr>
+        <w:tc>
+          <w:tcPr>
+            <w:tcW w:type="dxa" w:w="2030"/>
+            <w:shd w:val="clear" w:color="auto" w:fill="F2F5F9"/>
+          </w:tcPr>
+          <w:p>
+            <w:r/>
+            <w:r>
+              <w:rPr>
+                <w:sz w:val="18"/>
+              </w:rPr>
+              <w:t>stdevdata03</w:t>
+            </w:r>
+          </w:p>
+        </w:tc>
+        <w:tc>
+          <w:tcPr>
+            <w:tcW w:type="dxa" w:w="2301"/>
+            <w:shd w:val="clear" w:color="auto" w:fill="F2F5F9"/>
+          </w:tcPr>
+          <w:p>
+            <w:r/>
+            <w:r>
+              <w:rPr>
+                <w:sz w:val="18"/>
+              </w:rPr>
+              <w:t>Contoso-NonProduction</w:t>
+            </w:r>
+          </w:p>
+        </w:tc>
+        <w:tc>
+          <w:tcPr>
+            <w:tcW w:type="dxa" w:w="1624"/>
+            <w:shd w:val="clear" w:color="auto" w:fill="F2F5F9"/>
+          </w:tcPr>
+          <w:p>
+            <w:r/>
+            <w:r>
+              <w:rPr>
+                <w:sz w:val="18"/>
+              </w:rPr>
+              <w:t>Standard_ZRS</w:t>
+            </w:r>
+          </w:p>
+        </w:tc>
+        <w:tc>
+          <w:tcPr>
+            <w:tcW w:type="dxa" w:w="1083"/>
+            <w:shd w:val="clear" w:color="auto" w:fill="F2F5F9"/>
+          </w:tcPr>
+          <w:p>
+            <w:r/>
+            <w:r>
+              <w:rPr>
+                <w:sz w:val="18"/>
+              </w:rPr>
+              <w:t>No</w:t>
+            </w:r>
+          </w:p>
+        </w:tc>
+        <w:tc>
+          <w:tcPr>
+            <w:tcW w:type="dxa" w:w="1083"/>
+            <w:shd w:val="clear" w:color="auto" w:fill="F2F5F9"/>
+          </w:tcPr>
+          <w:p>
+            <w:r/>
+            <w:r>
+              <w:rPr>
+                <w:sz w:val="18"/>
+              </w:rPr>
+              <w:t>TLS1_2</w:t>
+            </w:r>
+          </w:p>
+        </w:tc>
+        <w:tc>
+          <w:tcPr>
+            <w:tcW w:type="dxa" w:w="1624"/>
+            <w:shd w:val="clear" w:color="auto" w:fill="F2F5F9"/>
+          </w:tcPr>
+          <w:p>
+            <w:r/>
+            <w:r>
+              <w:rPr>
+                <w:sz w:val="18"/>
+              </w:rPr>
+              <w:t>Blocked</w:t>
+            </w:r>
+          </w:p>
+        </w:tc>
+      </w:tr>
+      <w:tr>
+        <w:tc>
+          <w:tcPr>
+            <w:tcW w:type="dxa" w:w="2030"/>
+          </w:tcPr>
+          <w:p>
+            <w:r/>
+            <w:r>
+              <w:rPr>
+                <w:sz w:val="18"/>
+              </w:rPr>
+              <w:t>stdevdata04</w:t>
+            </w:r>
+          </w:p>
+        </w:tc>
+        <w:tc>
+          <w:tcPr>
+            <w:tcW w:type="dxa" w:w="2301"/>
+          </w:tcPr>
+          <w:p>
+            <w:r/>
+            <w:r>
+              <w:rPr>
+                <w:sz w:val="18"/>
+              </w:rPr>
+              <w:t>Contoso-NonProduction</w:t>
+            </w:r>
+          </w:p>
+        </w:tc>
+        <w:tc>
+          <w:tcPr>
+            <w:tcW w:type="dxa" w:w="1624"/>
+          </w:tcPr>
+          <w:p>
+            <w:r/>
+            <w:r>
+              <w:rPr>
+                <w:sz w:val="18"/>
+              </w:rPr>
+              <w:t>Standard_GRS</w:t>
+            </w:r>
+          </w:p>
+        </w:tc>
+        <w:tc>
+          <w:tcPr>
+            <w:tcW w:type="dxa" w:w="1083"/>
+          </w:tcPr>
+          <w:p>
+            <w:r/>
+            <w:r>
+              <w:rPr>
+                <w:sz w:val="18"/>
+              </w:rPr>
+              <w:t>Yes</w:t>
+            </w:r>
+          </w:p>
+        </w:tc>
+        <w:tc>
+          <w:tcPr>
+            <w:tcW w:type="dxa" w:w="1083"/>
+          </w:tcPr>
+          <w:p>
+            <w:r/>
+            <w:r>
+              <w:rPr>
+                <w:sz w:val="18"/>
+              </w:rPr>
+              <w:t>TLS1_0</w:t>
+            </w:r>
+          </w:p>
+        </w:tc>
+        <w:tc>
+          <w:tcPr>
+            <w:tcW w:type="dxa" w:w="1624"/>
+          </w:tcPr>
+          <w:p>
+            <w:r/>
+            <w:r>
+              <w:rPr>
+                <w:sz w:val="18"/>
+              </w:rPr>
+              <w:t>Blocked</w:t>
+            </w:r>
+          </w:p>
+        </w:tc>
+      </w:tr>
+      <w:tr>
+        <w:tc>
+          <w:tcPr>
+            <w:tcW w:type="dxa" w:w="2030"/>
+            <w:shd w:val="clear" w:color="auto" w:fill="F2F5F9"/>
+          </w:tcPr>
+          <w:p>
+            <w:r/>
+            <w:r>
+              <w:rPr>
+                <w:sz w:val="18"/>
+              </w:rPr>
+              <w:t>stprddata00</w:t>
+            </w:r>
+          </w:p>
+        </w:tc>
+        <w:tc>
+          <w:tcPr>
+            <w:tcW w:type="dxa" w:w="2301"/>
+            <w:shd w:val="clear" w:color="auto" w:fill="F2F5F9"/>
+          </w:tcPr>
+          <w:p>
+            <w:r/>
+            <w:r>
+              <w:rPr>
+                <w:sz w:val="18"/>
+              </w:rPr>
+              <w:t>Contoso-Production</w:t>
+            </w:r>
+          </w:p>
+        </w:tc>
+        <w:tc>
+          <w:tcPr>
+            <w:tcW w:type="dxa" w:w="1624"/>
+            <w:shd w:val="clear" w:color="auto" w:fill="F2F5F9"/>
+          </w:tcPr>
+          <w:p>
+            <w:r/>
+            <w:r>
+              <w:rPr>
+                <w:sz w:val="18"/>
+              </w:rPr>
+              <w:t>Standard_LRS</w:t>
+            </w:r>
+          </w:p>
+        </w:tc>
+        <w:tc>
+          <w:tcPr>
+            <w:tcW w:type="dxa" w:w="1083"/>
+            <w:shd w:val="clear" w:color="auto" w:fill="F2F5F9"/>
+          </w:tcPr>
+          <w:p>
+            <w:r/>
+            <w:r>
+              <w:rPr>
+                <w:sz w:val="18"/>
+              </w:rPr>
+              <w:t>Yes</w:t>
+            </w:r>
+          </w:p>
+        </w:tc>
+        <w:tc>
+          <w:tcPr>
+            <w:tcW w:type="dxa" w:w="1083"/>
+            <w:shd w:val="clear" w:color="auto" w:fill="F2F5F9"/>
+          </w:tcPr>
+          <w:p>
+            <w:r/>
+            <w:r>
+              <w:rPr>
+                <w:sz w:val="18"/>
+              </w:rPr>
+              <w:t>TLS1_2</w:t>
+            </w:r>
+          </w:p>
+        </w:tc>
+        <w:tc>
+          <w:tcPr>
+            <w:tcW w:type="dxa" w:w="1624"/>
+            <w:shd w:val="clear" w:color="auto" w:fill="F2F5F9"/>
+          </w:tcPr>
+          <w:p>
+            <w:r/>
+            <w:r>
+              <w:rPr>
+                <w:sz w:val="18"/>
+              </w:rPr>
+              <w:t>Blocked</w:t>
+            </w:r>
+          </w:p>
+        </w:tc>
+      </w:tr>
+      <w:tr>
+        <w:tc>
+          <w:tcPr>
+            <w:tcW w:type="dxa" w:w="2030"/>
+          </w:tcPr>
+          <w:p>
+            <w:r/>
+            <w:r>
+              <w:rPr>
+                <w:sz w:val="18"/>
+              </w:rPr>
+              <w:t>stprddata01</w:t>
+            </w:r>
+          </w:p>
+        </w:tc>
+        <w:tc>
+          <w:tcPr>
+            <w:tcW w:type="dxa" w:w="2301"/>
+          </w:tcPr>
+          <w:p>
+            <w:r/>
+            <w:r>
+              <w:rPr>
+                <w:sz w:val="18"/>
+              </w:rPr>
+              <w:t>Contoso-Production</w:t>
+            </w:r>
+          </w:p>
+        </w:tc>
+        <w:tc>
+          <w:tcPr>
+            <w:tcW w:type="dxa" w:w="1624"/>
+          </w:tcPr>
+          <w:p>
+            <w:r/>
+            <w:r>
+              <w:rPr>
+                <w:sz w:val="18"/>
+              </w:rPr>
+              <w:t>Standard_GRS</w:t>
+            </w:r>
+          </w:p>
+        </w:tc>
+        <w:tc>
+          <w:tcPr>
+            <w:tcW w:type="dxa" w:w="1083"/>
+          </w:tcPr>
+          <w:p>
+            <w:r/>
+            <w:r>
+              <w:rPr>
+                <w:sz w:val="18"/>
+              </w:rPr>
+              <w:t>Yes</w:t>
+            </w:r>
+          </w:p>
+        </w:tc>
+        <w:tc>
+          <w:tcPr>
+            <w:tcW w:type="dxa" w:w="1083"/>
+          </w:tcPr>
+          <w:p>
+            <w:r/>
+            <w:r>
+              <w:rPr>
+                <w:sz w:val="18"/>
+              </w:rPr>
+              <w:t>TLS1_2</w:t>
+            </w:r>
+          </w:p>
+        </w:tc>
+        <w:tc>
+          <w:tcPr>
+            <w:tcW w:type="dxa" w:w="1624"/>
+          </w:tcPr>
+          <w:p>
+            <w:r/>
+            <w:r>
+              <w:rPr>
+                <w:sz w:val="18"/>
+              </w:rPr>
+              <w:t>Blocked</w:t>
+            </w:r>
+          </w:p>
+        </w:tc>
+      </w:tr>
+      <w:tr>
+        <w:tc>
+          <w:tcPr>
+            <w:tcW w:type="dxa" w:w="2030"/>
+            <w:shd w:val="clear" w:color="auto" w:fill="F2F5F9"/>
+          </w:tcPr>
+          <w:p>
+            <w:r/>
+            <w:r>
+              <w:rPr>
+                <w:sz w:val="18"/>
+              </w:rPr>
+              <w:t>stprddata02</w:t>
+            </w:r>
+          </w:p>
+        </w:tc>
+        <w:tc>
+          <w:tcPr>
+            <w:tcW w:type="dxa" w:w="2301"/>
+            <w:shd w:val="clear" w:color="auto" w:fill="F2F5F9"/>
+          </w:tcPr>
+          <w:p>
+            <w:r/>
+            <w:r>
+              <w:rPr>
+                <w:sz w:val="18"/>
+              </w:rPr>
+              <w:t>Contoso-Production</w:t>
+            </w:r>
+          </w:p>
+        </w:tc>
+        <w:tc>
+          <w:tcPr>
+            <w:tcW w:type="dxa" w:w="1624"/>
+            <w:shd w:val="clear" w:color="auto" w:fill="F2F5F9"/>
+          </w:tcPr>
+          <w:p>
+            <w:r/>
+            <w:r>
+              <w:rPr>
+                <w:sz w:val="18"/>
+              </w:rPr>
+              <w:t>Standard_ZRS</w:t>
+            </w:r>
+          </w:p>
+        </w:tc>
+        <w:tc>
+          <w:tcPr>
+            <w:tcW w:type="dxa" w:w="1083"/>
+            <w:shd w:val="clear" w:color="auto" w:fill="F2F5F9"/>
+          </w:tcPr>
+          <w:p>
+            <w:r/>
+            <w:r>
+              <w:rPr>
+                <w:sz w:val="18"/>
+              </w:rPr>
+              <w:t>Yes</w:t>
+            </w:r>
+          </w:p>
+        </w:tc>
+        <w:tc>
+          <w:tcPr>
+            <w:tcW w:type="dxa" w:w="1083"/>
+            <w:shd w:val="clear" w:color="auto" w:fill="F2F5F9"/>
+          </w:tcPr>
+          <w:p>
+            <w:r/>
+            <w:r>
+              <w:rPr>
+                <w:sz w:val="18"/>
+              </w:rPr>
+              <w:t>TLS1_2</w:t>
+            </w:r>
+          </w:p>
+        </w:tc>
+        <w:tc>
+          <w:tcPr>
+            <w:tcW w:type="dxa" w:w="1624"/>
+            <w:shd w:val="clear" w:color="auto" w:fill="F2F5F9"/>
+          </w:tcPr>
+          <w:p>
+            <w:r/>
+            <w:r>
+              <w:rPr>
+                <w:sz w:val="18"/>
+              </w:rPr>
+              <w:t>Allowed</w:t>
+            </w:r>
+          </w:p>
+        </w:tc>
+      </w:tr>
+      <w:tr>
+        <w:tc>
+          <w:tcPr>
+            <w:tcW w:type="dxa" w:w="2030"/>
+          </w:tcPr>
+          <w:p>
+            <w:r/>
+            <w:r>
+              <w:rPr>
+                <w:sz w:val="18"/>
+              </w:rPr>
+              <w:t>stprddata03</w:t>
+            </w:r>
+          </w:p>
+        </w:tc>
+        <w:tc>
+          <w:tcPr>
+            <w:tcW w:type="dxa" w:w="2301"/>
+          </w:tcPr>
+          <w:p>
+            <w:r/>
+            <w:r>
+              <w:rPr>
+                <w:sz w:val="18"/>
+              </w:rPr>
+              <w:t>Contoso-Production</w:t>
+            </w:r>
+          </w:p>
+        </w:tc>
+        <w:tc>
+          <w:tcPr>
+            <w:tcW w:type="dxa" w:w="1624"/>
+          </w:tcPr>
+          <w:p>
+            <w:r/>
+            <w:r>
+              <w:rPr>
+                <w:sz w:val="18"/>
+              </w:rPr>
+              <w:t>Standard_ZRS</w:t>
+            </w:r>
+          </w:p>
+        </w:tc>
+        <w:tc>
+          <w:tcPr>
+            <w:tcW w:type="dxa" w:w="1083"/>
+          </w:tcPr>
+          <w:p>
+            <w:r/>
+            <w:r>
+              <w:rPr>
+                <w:sz w:val="18"/>
+              </w:rPr>
+              <w:t>No</w:t>
+            </w:r>
+          </w:p>
+        </w:tc>
+        <w:tc>
+          <w:tcPr>
+            <w:tcW w:type="dxa" w:w="1083"/>
+          </w:tcPr>
+          <w:p>
+            <w:r/>
+            <w:r>
+              <w:rPr>
+                <w:sz w:val="18"/>
+              </w:rPr>
+              <w:t>TLS1_2</w:t>
+            </w:r>
+          </w:p>
+        </w:tc>
+        <w:tc>
+          <w:tcPr>
+            <w:tcW w:type="dxa" w:w="1624"/>
+          </w:tcPr>
+          <w:p>
+            <w:r/>
+            <w:r>
+              <w:rPr>
+                <w:sz w:val="18"/>
+              </w:rPr>
+              <w:t>Blocked</w:t>
+            </w:r>
+          </w:p>
+        </w:tc>
+      </w:tr>
+      <w:tr>
+        <w:tc>
+          <w:tcPr>
+            <w:tcW w:type="dxa" w:w="2030"/>
+            <w:shd w:val="clear" w:color="auto" w:fill="F2F5F9"/>
+          </w:tcPr>
+          <w:p>
+            <w:r/>
+            <w:r>
+              <w:rPr>
+                <w:sz w:val="18"/>
+              </w:rPr>
+              <w:t>stprddata04</w:t>
+            </w:r>
+          </w:p>
+        </w:tc>
+        <w:tc>
+          <w:tcPr>
+            <w:tcW w:type="dxa" w:w="2301"/>
+            <w:shd w:val="clear" w:color="auto" w:fill="F2F5F9"/>
+          </w:tcPr>
+          <w:p>
+            <w:r/>
+            <w:r>
+              <w:rPr>
+                <w:sz w:val="18"/>
+              </w:rPr>
+              <w:t>Contoso-Production</w:t>
+            </w:r>
+          </w:p>
+        </w:tc>
+        <w:tc>
+          <w:tcPr>
+            <w:tcW w:type="dxa" w:w="1624"/>
+            <w:shd w:val="clear" w:color="auto" w:fill="F2F5F9"/>
+          </w:tcPr>
+          <w:p>
+            <w:r/>
+            <w:r>
+              <w:rPr>
+                <w:sz w:val="18"/>
+              </w:rPr>
+              <w:t>Standard_LRS</w:t>
+            </w:r>
+          </w:p>
+        </w:tc>
+        <w:tc>
+          <w:tcPr>
+            <w:tcW w:type="dxa" w:w="1083"/>
+            <w:shd w:val="clear" w:color="auto" w:fill="F2F5F9"/>
+          </w:tcPr>
+          <w:p>
+            <w:r/>
+            <w:r>
+              <w:rPr>
+                <w:sz w:val="18"/>
+              </w:rPr>
+              <w:t>No</w:t>
+            </w:r>
+          </w:p>
+        </w:tc>
+        <w:tc>
+          <w:tcPr>
+            <w:tcW w:type="dxa" w:w="1083"/>
+            <w:shd w:val="clear" w:color="auto" w:fill="F2F5F9"/>
+          </w:tcPr>
+          <w:p>
+            <w:r/>
+            <w:r>
+              <w:rPr>
+                <w:sz w:val="18"/>
+              </w:rPr>
+              <w:t>TLS1_2</w:t>
+            </w:r>
+          </w:p>
+        </w:tc>
+        <w:tc>
+          <w:tcPr>
+            <w:tcW w:type="dxa" w:w="1624"/>
+            <w:shd w:val="clear" w:color="auto" w:fill="F2F5F9"/>
+          </w:tcPr>
+          <w:p>
+            <w:r/>
+            <w:r>
+              <w:rPr>
+                <w:sz w:val="18"/>
+              </w:rPr>
+              <w:t>Allowed</w:t>
+            </w:r>
+          </w:p>
+        </w:tc>
+      </w:tr>
+    </w:tbl>
+    <w:p/>
+    <w:p>
+      <w:pPr>
+        <w:keepNext/>
+      </w:pPr>
+      <w:r>
+        <w:rPr>
+          <w:b/>
+        </w:rPr>
+        <w:t>Related findings</w:t>
+      </w:r>
+    </w:p>
+    <w:p>
+      <w:pPr>
+        <w:pStyle w:val="ListBullet"/>
+      </w:pPr>
+      <w:r>
+        <w:t xml:space="preserve">SEC-001 Storage account permits HTTP: </w:t>
+      </w:r>
+      <w:r>
+        <w:rPr>
+          <w:b/>
+          <w:color w:val="D03B3B"/>
+        </w:rPr>
+        <w:t>High</w:t>
+      </w:r>
+      <w:r>
+        <w:t>, 4 resources (see 5.1 Security)</w:t>
+      </w:r>
+    </w:p>
+    <w:p>
+      <w:pPr>
+        <w:pStyle w:val="ListBullet"/>
+      </w:pPr>
+      <w:r>
+        <w:t xml:space="preserve">SEC-002 Storage account allows anonymous blob access: </w:t>
+      </w:r>
+      <w:r>
+        <w:rPr>
+          <w:b/>
+          <w:color w:val="D03B3B"/>
+        </w:rPr>
+        <w:t>High</w:t>
+      </w:r>
+      <w:r>
+        <w:t>, 4 resources (see 5.1 Security)</w:t>
+      </w:r>
+    </w:p>
+    <w:p>
+      <w:pPr>
+        <w:pStyle w:val="ListBullet"/>
+      </w:pPr>
+      <w:r>
+        <w:t xml:space="preserve">SEC-003 Storage account accepts TLS &lt; 1.2: </w:t>
+      </w:r>
+      <w:r>
+        <w:rPr>
+          <w:b/>
+          <w:color w:val="EC835A"/>
+        </w:rPr>
+        <w:t>Medium</w:t>
+      </w:r>
+      <w:r>
+        <w:t>, 2 resources (see 5.1 Security)</w:t>
+      </w:r>
+    </w:p>
+    <w:p>
+      <w:pPr>
+        <w:pStyle w:val="ListBullet"/>
+      </w:pPr>
+      <w:r>
+        <w:t xml:space="preserve">REL-003 Storage account uses locally redundant replication: </w:t>
+      </w:r>
+      <w:r>
+        <w:rPr>
+          <w:b/>
+          <w:color w:val="9A6700"/>
+        </w:rPr>
+        <w:t>Low</w:t>
+      </w:r>
+      <w:r>
+        <w:t>, 3 resources (see 5.2 Reliability)</w:t>
+      </w:r>
+    </w:p>
+    <w:p>
+      <w:pPr>
+        <w:pStyle w:val="Heading2"/>
+      </w:pPr>
+      <w:r>
+        <w:t>3.7 Databases</w:t>
+      </w:r>
+    </w:p>
+    <w:p>
+      <w:r>
+        <w:t>Azure SQL is used with 2 logical servers hosting 6 databases on the S1 (3), Basic (2) and GP_Gen5_2 (1) service tiers.</w:t>
+      </w:r>
+    </w:p>
+    <w:p>
+      <w:r>
+        <w:t>Public network access is enabled on sql-dev-01; 1 of 6 databases is zone redundant.</w:t>
+      </w:r>
+    </w:p>
+    <w:p>
+      <w:pPr>
+        <w:keepNext/>
+      </w:pPr>
+      <w:r>
+        <w:rPr>
+          <w:b/>
+        </w:rPr>
+        <w:t>Related findings</w:t>
+      </w:r>
+    </w:p>
+    <w:p>
+      <w:pPr>
+        <w:pStyle w:val="ListBullet"/>
+      </w:pPr>
+      <w:r>
+        <w:t xml:space="preserve">SEC-005 SQL server reachable from public networks: </w:t>
+      </w:r>
+      <w:r>
+        <w:rPr>
+          <w:b/>
+          <w:color w:val="EC835A"/>
+        </w:rPr>
+        <w:t>Medium</w:t>
+      </w:r>
+      <w:r>
+        <w:t>, 1 resource (see 5.1 Security)</w:t>
+      </w:r>
+    </w:p>
+    <w:p>
+      <w:pPr>
+        <w:pStyle w:val="ListBullet"/>
+      </w:pPr>
+      <w:r>
+        <w:t xml:space="preserve">REL-004 SQL database not zone redundant: </w:t>
+      </w:r>
+      <w:r>
+        <w:rPr>
+          <w:b/>
+          <w:color w:val="9A6700"/>
+        </w:rPr>
+        <w:t>Low</w:t>
+      </w:r>
+      <w:r>
+        <w:t>, 3 resources (see 5.2 Reliability)</w:t>
+      </w:r>
+    </w:p>
+    <w:p>
+      <w:pPr>
+        <w:pStyle w:val="Heading2"/>
+      </w:pPr>
+      <w:r>
+        <w:t>3.8 Application hosting</w:t>
+      </w:r>
+    </w:p>
+    <w:p>
+      <w:r>
+        <w:t>Web workloads run on Azure App Service: 8 apps hosted on 4 App Service plans (P1v3 (2), S1 (1) and B1 (1) pricing tiers).</w:t>
+      </w:r>
+    </w:p>
+    <w:p>
+      <w:r>
+        <w:t>6 of 8 apps enforce HTTPS-only access. The plan(s) asp-dev-00 and asp-dev-01 host no apps but still incur charges.</w:t>
+      </w:r>
+    </w:p>
+    <w:p>
+      <w:pPr>
+        <w:keepNext/>
+      </w:pPr>
+      <w:r>
+        <w:rPr>
+          <w:b/>
+        </w:rPr>
+        <w:t>Related findings</w:t>
+      </w:r>
+    </w:p>
+    <w:p>
+      <w:pPr>
+        <w:pStyle w:val="ListBullet"/>
+      </w:pPr>
+      <w:r>
+        <w:t xml:space="preserve">SEC-006 Web app does not enforce HTTPS: </w:t>
+      </w:r>
+      <w:r>
+        <w:rPr>
+          <w:b/>
+          <w:color w:val="D03B3B"/>
+        </w:rPr>
+        <w:t>High</w:t>
+      </w:r>
+      <w:r>
+        <w:t>, 2 resources (see 5.1 Security)</w:t>
+      </w:r>
+    </w:p>
+    <w:p>
+      <w:pPr>
+        <w:pStyle w:val="ListBullet"/>
+      </w:pPr>
+      <w:r>
+        <w:t xml:space="preserve">COST-005 Empty App Service plan: </w:t>
+      </w:r>
+      <w:r>
+        <w:rPr>
+          <w:b/>
+          <w:color w:val="EC835A"/>
+        </w:rPr>
+        <w:t>Medium</w:t>
+      </w:r>
+      <w:r>
+        <w:t>, 2 resources (see 5.3 Cost Optimization)</w:t>
+      </w:r>
+    </w:p>
+    <w:p>
+      <w:pPr>
+        <w:pStyle w:val="Heading2"/>
+      </w:pPr>
+      <w:r>
+        <w:t>3.9 Security services</w:t>
+      </w:r>
+    </w:p>
+    <w:p>
+      <w:r>
+        <w:t>Secrets, keys and certificates are held in 4 Key Vaults (kv-dev-00, kv-dev-01, kv-prd-00 and kv-prd-01).</w:t>
+      </w:r>
+    </w:p>
+    <w:p>
+      <w:r>
+        <w:t>3 of 4 vaults have purge protection enabled, which prevents deleted secrets from being permanently removed during the retention period.</w:t>
+      </w:r>
+    </w:p>
+    <w:p>
+      <w:r>
+        <w:t>Network perimeter protection is provided by 2 Azure Firewalls in eastus and westeurope.</w:t>
+      </w:r>
+    </w:p>
+    <w:p>
+      <w:pPr>
+        <w:keepNext/>
+      </w:pPr>
+      <w:r>
+        <w:rPr>
+          <w:b/>
+        </w:rPr>
+        <w:t>Related findings</w:t>
+      </w:r>
+    </w:p>
+    <w:p>
+      <w:pPr>
+        <w:pStyle w:val="ListBullet"/>
+      </w:pPr>
+      <w:r>
+        <w:t xml:space="preserve">SEC-004 Key Vault purge protection disabled: </w:t>
+      </w:r>
+      <w:r>
+        <w:rPr>
+          <w:b/>
+          <w:color w:val="EC835A"/>
+        </w:rPr>
+        <w:t>Medium</w:t>
+      </w:r>
+      <w:r>
+        <w:t>, 1 resource (see 5.1 Security)</w:t>
+      </w:r>
+    </w:p>
+    <w:p>
+      <w:pPr>
+        <w:pStyle w:val="Heading2"/>
+      </w:pPr>
+      <w:r>
+        <w:t>3.10 Monitoring and management</w:t>
+      </w:r>
+    </w:p>
+    <w:p>
+      <w:r>
+        <w:t>Logs are collected in 2 Log Analytics workspaces (log-dev-01 and log-prd-01).</w:t>
+      </w:r>
+    </w:p>
+    <w:p>
+      <w:r>
+        <w:t>Log retention is 30 days on 2 workspaces.</w:t>
+      </w:r>
+    </w:p>
+    <w:p>
+      <w:r>
+        <w:t>No Recovery Services vault was found, so there is no evidence of Azure Backup protecting the virtual machines or databases.</w:t>
+      </w:r>
+    </w:p>
+    <w:p>
+      <w:pPr>
+        <w:keepNext/>
+      </w:pPr>
+      <w:r>
+        <w:rPr>
+          <w:b/>
+        </w:rPr>
+        <w:t>Related findings</w:t>
+      </w:r>
+    </w:p>
+    <w:p>
+      <w:pPr>
+        <w:pStyle w:val="ListBullet"/>
+      </w:pPr>
+      <w:r>
+        <w:t xml:space="preserve">OPS-002 Log Analytics retention below target: </w:t>
+      </w:r>
+      <w:r>
+        <w:rPr>
+          <w:b/>
+          <w:color w:val="9A6700"/>
+        </w:rPr>
+        <w:t>Low</w:t>
+      </w:r>
+      <w:r>
+        <w:t>, 2 resources (see 5.4 Operational Excellence)</w:t>
+      </w:r>
+    </w:p>
+    <w:p>
+      <w:pPr>
+        <w:pStyle w:val="Heading2"/>
+      </w:pPr>
+      <w:r>
+        <w:t>3.11 Governance and tagging</w:t>
+      </w:r>
+    </w:p>
+    <w:p>
+      <w:r>
+        <w:t>116 of 133 resources (87%) carry at least one tag, and 74% carry all of the required tags (environment, owner and costCenter).</w:t>
+      </w:r>
+    </w:p>
+    <w:p>
+      <w:r>
+        <w:t>In total 3 distinct tag keys are in use, most often costCenter (107), environment (106) and owner (106).</w:t>
+      </w:r>
+    </w:p>
+    <w:p>
+      <w:r>
+        <w:t>1 resource still uses the classic (Azure Service Manager) deployment model (legacy-cloudservice). This model is retired, so it needs migrating to Azure Resource Manager.</w:t>
+      </w:r>
+    </w:p>
+    <w:p>
+      <w:pPr>
+        <w:keepNext/>
+      </w:pPr>
+      <w:r>
+        <w:rPr>
+          <w:b/>
+          <w:color w:val="52514E"/>
+          <w:sz w:val="19"/>
+        </w:rPr>
+        <w:t>Required tag coverage</w:t>
+      </w:r>
+    </w:p>
+    <w:tbl>
+      <w:tblPr>
+        <w:tblStyle w:val="TableGrid"/>
+        <w:jc w:val="center"/>
+        <w:tblLayout w:type="fixed"/>
+        <w:tblLook w:firstColumn="1" w:firstRow="1" w:lastColumn="0" w:lastRow="0" w:noHBand="0" w:noVBand="1" w:val="04A0"/>
+        <w:tblW w:w="9746" w:type="dxa"/>
+      </w:tblPr>
+      <w:tblGrid>
+        <w:gridCol w:w="1772"/>
+        <w:gridCol w:w="1772"/>
+        <w:gridCol w:w="1402"/>
+        <w:gridCol w:w="4799"/>
+      </w:tblGrid>
+      <w:tr>
+        <w:trPr>
+          <w:tblHeader w:val="true"/>
+        </w:trPr>
+        <w:tc>
+          <w:tcPr>
+            <w:tcW w:type="dxa" w:w="1772"/>
+            <w:shd w:val="clear" w:color="auto" w:fill="0F3B68"/>
+          </w:tcPr>
+          <w:p>
+            <w:r/>
+            <w:r>
+              <w:rPr>
+                <w:b/>
+                <w:color w:val="FFFFFF"/>
+                <w:sz w:val="18"/>
+              </w:rPr>
+              <w:t>Tag</w:t>
+            </w:r>
+          </w:p>
+        </w:tc>
+        <w:tc>
+          <w:tcPr>
+            <w:tcW w:type="dxa" w:w="1772"/>
+            <w:shd w:val="clear" w:color="auto" w:fill="0F3B68"/>
+          </w:tcPr>
+          <w:p>
+            <w:r/>
+            <w:r>
+              <w:rPr>
+                <w:b/>
+                <w:color w:val="FFFFFF"/>
+                <w:sz w:val="18"/>
+              </w:rPr>
+              <w:t>Resources tagged</w:t>
+            </w:r>
+          </w:p>
+        </w:tc>
+        <w:tc>
+          <w:tcPr>
+            <w:tcW w:type="dxa" w:w="1403"/>
+            <w:shd w:val="clear" w:color="auto" w:fill="0F3B68"/>
+          </w:tcPr>
+          <w:p>
+            <w:r/>
+            <w:r>
+              <w:rPr>
+                <w:b/>
+                <w:color w:val="FFFFFF"/>
+                <w:sz w:val="18"/>
+              </w:rPr>
+              <w:t>Coverage</w:t>
+            </w:r>
+          </w:p>
+        </w:tc>
+        <w:tc>
+          <w:tcPr>
+            <w:tcW w:type="dxa" w:w="4799"/>
+            <w:shd w:val="clear" w:color="auto" w:fill="0F3B68"/>
+          </w:tcPr>
+          <w:p>
+            <w:r/>
+            <w:r>
+              <w:rPr>
+                <w:b/>
+                <w:color w:val="FFFFFF"/>
+                <w:sz w:val="18"/>
+              </w:rPr>
+              <w:t>Most common values</w:t>
+            </w:r>
+          </w:p>
+        </w:tc>
+      </w:tr>
+      <w:tr>
+        <w:tc>
+          <w:tcPr>
+            <w:tcW w:type="dxa" w:w="1772"/>
+          </w:tcPr>
+          <w:p>
+            <w:r/>
+            <w:r>
+              <w:rPr>
+                <w:sz w:val="18"/>
+              </w:rPr>
+              <w:t>environment</w:t>
+            </w:r>
+          </w:p>
+        </w:tc>
+        <w:tc>
+          <w:tcPr>
+            <w:tcW w:type="dxa" w:w="1772"/>
+          </w:tcPr>
+          <w:p>
+            <w:r/>
+            <w:r>
+              <w:rPr>
+                <w:sz w:val="18"/>
+              </w:rPr>
+              <w:t>106</w:t>
+            </w:r>
+          </w:p>
+        </w:tc>
+        <w:tc>
+          <w:tcPr>
+            <w:tcW w:type="dxa" w:w="1403"/>
+          </w:tcPr>
+          <w:p>
+            <w:r/>
+            <w:r>
+              <w:rPr>
+                <w:sz w:val="18"/>
+              </w:rPr>
+              <w:t>80%</w:t>
+            </w:r>
+          </w:p>
+        </w:tc>
+        <w:tc>
+          <w:tcPr>
+            <w:tcW w:type="dxa" w:w="4799"/>
+          </w:tcPr>
+          <w:p>
+            <w:r/>
+            <w:r>
+              <w:rPr>
+                <w:sz w:val="18"/>
+              </w:rPr>
+              <w:t>prod (52), dev (42), shared (12)</w:t>
+            </w:r>
+          </w:p>
+        </w:tc>
+      </w:tr>
+      <w:tr>
+        <w:tc>
+          <w:tcPr>
+            <w:tcW w:type="dxa" w:w="1772"/>
+            <w:shd w:val="clear" w:color="auto" w:fill="F2F5F9"/>
+          </w:tcPr>
+          <w:p>
+            <w:r/>
+            <w:r>
+              <w:rPr>
+                <w:sz w:val="18"/>
+              </w:rPr>
+              <w:t>owner</w:t>
+            </w:r>
+          </w:p>
+        </w:tc>
+        <w:tc>
+          <w:tcPr>
+            <w:tcW w:type="dxa" w:w="1772"/>
+            <w:shd w:val="clear" w:color="auto" w:fill="F2F5F9"/>
+          </w:tcPr>
+          <w:p>
+            <w:r/>
+            <w:r>
+              <w:rPr>
+                <w:sz w:val="18"/>
+              </w:rPr>
+              <w:t>106</w:t>
+            </w:r>
+          </w:p>
+        </w:tc>
+        <w:tc>
+          <w:tcPr>
+            <w:tcW w:type="dxa" w:w="1403"/>
+            <w:shd w:val="clear" w:color="auto" w:fill="F2F5F9"/>
+          </w:tcPr>
+          <w:p>
+            <w:r/>
+            <w:r>
+              <w:rPr>
+                <w:sz w:val="18"/>
+              </w:rPr>
+              <w:t>80%</w:t>
+            </w:r>
+          </w:p>
+        </w:tc>
+        <w:tc>
+          <w:tcPr>
+            <w:tcW w:type="dxa" w:w="4799"/>
+            <w:shd w:val="clear" w:color="auto" w:fill="F2F5F9"/>
+          </w:tcPr>
+          <w:p>
+            <w:r/>
+            <w:r>
+              <w:rPr>
+                <w:sz w:val="18"/>
+              </w:rPr>
+              <w:t>app-team (37), platform (35), data-team (34)</w:t>
+            </w:r>
+          </w:p>
+        </w:tc>
+      </w:tr>
+      <w:tr>
+        <w:tc>
+          <w:tcPr>
+            <w:tcW w:type="dxa" w:w="1772"/>
+          </w:tcPr>
+          <w:p>
+            <w:r/>
+            <w:r>
+              <w:rPr>
+                <w:sz w:val="18"/>
+              </w:rPr>
+              <w:t>costCenter</w:t>
+            </w:r>
+          </w:p>
+        </w:tc>
+        <w:tc>
+          <w:tcPr>
+            <w:tcW w:type="dxa" w:w="1772"/>
+          </w:tcPr>
+          <w:p>
+            <w:r/>
+            <w:r>
+              <w:rPr>
+                <w:sz w:val="18"/>
+              </w:rPr>
+              <w:t>107</w:t>
+            </w:r>
+          </w:p>
+        </w:tc>
+        <w:tc>
+          <w:tcPr>
+            <w:tcW w:type="dxa" w:w="1403"/>
+          </w:tcPr>
+          <w:p>
+            <w:r/>
+            <w:r>
+              <w:rPr>
+                <w:sz w:val="18"/>
+              </w:rPr>
+              <w:t>80%</w:t>
+            </w:r>
+          </w:p>
+        </w:tc>
+        <w:tc>
+          <w:tcPr>
+            <w:tcW w:type="dxa" w:w="4799"/>
+          </w:tcPr>
+          <w:p>
+            <w:r/>
+            <w:r>
+              <w:rPr>
+                <w:sz w:val="18"/>
+              </w:rPr>
+              <w:t>CC300 (39), CC200 (35), CC100 (33)</w:t>
+            </w:r>
+          </w:p>
+        </w:tc>
+      </w:tr>
+    </w:tbl>
+    <w:p/>
+    <w:p>
+      <w:pPr>
+        <w:keepNext/>
+      </w:pPr>
+      <w:r>
+        <w:rPr>
+          <w:b/>
+        </w:rPr>
+        <w:t>Related findings</w:t>
+      </w:r>
+    </w:p>
+    <w:p>
+      <w:pPr>
+        <w:pStyle w:val="ListBullet"/>
+      </w:pPr>
+      <w:r>
+        <w:t xml:space="preserve">GOV-001 Required tags missing: </w:t>
+      </w:r>
+      <w:r>
+        <w:rPr>
+          <w:b/>
+          <w:color w:val="EC835A"/>
+        </w:rPr>
+        <w:t>Medium</w:t>
+      </w:r>
+      <w:r>
+        <w:t>, 34 resources (see 5.5 Governance)</w:t>
+      </w:r>
+    </w:p>
+    <w:p>
+      <w:pPr>
+        <w:pStyle w:val="ListBullet"/>
+      </w:pPr>
+      <w:r>
+        <w:t xml:space="preserve">GOV-002 Resource outside approved regions: </w:t>
+      </w:r>
+      <w:r>
+        <w:rPr>
+          <w:b/>
+          <w:color w:val="EC835A"/>
+        </w:rPr>
+        <w:t>Medium</w:t>
+      </w:r>
+      <w:r>
+        <w:t>, 8 resources (see 5.5 Governance)</w:t>
+      </w:r>
+    </w:p>
+    <w:p>
+      <w:pPr>
+        <w:pStyle w:val="ListBullet"/>
+      </w:pPr>
+      <w:r>
+        <w:t xml:space="preserve">GOV-003 Classic (ASM) resource in use: </w:t>
+      </w:r>
+      <w:r>
+        <w:rPr>
+          <w:b/>
+          <w:color w:val="D03B3B"/>
+        </w:rPr>
+        <w:t>High</w:t>
+      </w:r>
+      <w:r>
+        <w:t>, 1 resource (see 5.5 Governance)</w:t>
+      </w:r>
+    </w:p>
+    <w:p>
+      <w:pPr>
+        <w:pStyle w:val="Heading1"/>
+      </w:pPr>
+      <w:r>
+        <w:t>4. Inventory charts and statistics</w:t>
       </w:r>
     </w:p>
     <w:p>
@@ -2362,7 +6377,7 @@
         <w:pStyle w:val="Heading1"/>
       </w:pPr>
       <w:r>
-        <w:t>4. Assessment findings</w:t>
+        <w:t>5. Assessment findings</w:t>
       </w:r>
     </w:p>
     <w:p>
@@ -2406,7 +6421,7 @@
         <w:pStyle w:val="Heading2"/>
       </w:pPr>
       <w:r>
-        <w:t>4.1 Security — 65/100 (Fair)</w:t>
+        <w:t>5.1 Security — 65/100 (Fair)</w:t>
       </w:r>
     </w:p>
     <w:p>
@@ -2458,6 +6473,15 @@
       </w:r>
     </w:p>
     <w:p>
+      <w:r>
+        <w:rPr>
+          <w:i/>
+          <w:color w:val="52514E"/>
+        </w:rPr>
+        <w:t>Context: see 3.6 Storage in the infrastructure overview.</w:t>
+      </w:r>
+    </w:p>
+    <w:p>
       <w:pPr>
         <w:pStyle w:val="Heading3"/>
       </w:pPr>
@@ -2503,6 +6527,15 @@
       </w:r>
       <w:r>
         <w:t>stdevdata00, stdevdata01, stprddata02, stprddata04</w:t>
+      </w:r>
+    </w:p>
+    <w:p>
+      <w:r>
+        <w:rPr>
+          <w:i/>
+          <w:color w:val="52514E"/>
+        </w:rPr>
+        <w:t>Context: see 3.6 Storage in the infrastructure overview.</w:t>
       </w:r>
     </w:p>
     <w:p>
@@ -2554,6 +6587,15 @@
       </w:r>
     </w:p>
     <w:p>
+      <w:r>
+        <w:rPr>
+          <w:i/>
+          <w:color w:val="52514E"/>
+        </w:rPr>
+        <w:t>Context: see 3.8 Application hosting in the infrastructure overview.</w:t>
+      </w:r>
+    </w:p>
+    <w:p>
       <w:pPr>
         <w:pStyle w:val="Heading3"/>
       </w:pPr>
@@ -2599,6 +6641,15 @@
       </w:r>
       <w:r>
         <w:t>nsg-mgmt-eastus, nsg-mgmt-westeurope</w:t>
+      </w:r>
+    </w:p>
+    <w:p>
+      <w:r>
+        <w:rPr>
+          <w:i/>
+          <w:color w:val="52514E"/>
+        </w:rPr>
+        <w:t>Context: see 3.5 Networking in the infrastructure overview.</w:t>
       </w:r>
     </w:p>
     <w:p>
@@ -2650,6 +6701,15 @@
       </w:r>
     </w:p>
     <w:p>
+      <w:r>
+        <w:rPr>
+          <w:i/>
+          <w:color w:val="52514E"/>
+        </w:rPr>
+        <w:t>Context: see 3.6 Storage in the infrastructure overview.</w:t>
+      </w:r>
+    </w:p>
+    <w:p>
       <w:pPr>
         <w:pStyle w:val="Heading3"/>
       </w:pPr>
@@ -2695,6 +6755,15 @@
       </w:r>
       <w:r>
         <w:t>kv-dev-00</w:t>
+      </w:r>
+    </w:p>
+    <w:p>
+      <w:r>
+        <w:rPr>
+          <w:i/>
+          <w:color w:val="52514E"/>
+        </w:rPr>
+        <w:t>Context: see 3.9 Security services in the infrastructure overview.</w:t>
       </w:r>
     </w:p>
     <w:p>
@@ -2746,11 +6815,20 @@
       </w:r>
     </w:p>
     <w:p>
+      <w:r>
+        <w:rPr>
+          <w:i/>
+          <w:color w:val="52514E"/>
+        </w:rPr>
+        <w:t>Context: see 3.7 Databases in the infrastructure overview.</w:t>
+      </w:r>
+    </w:p>
+    <w:p>
       <w:pPr>
         <w:pStyle w:val="Heading2"/>
       </w:pPr>
       <w:r>
-        <w:t>4.2 Reliability — 75/100 (Fair)</w:t>
+        <w:t>5.2 Reliability — 75/100 (Fair)</w:t>
       </w:r>
     </w:p>
     <w:p>
@@ -2802,6 +6880,15 @@
       </w:r>
     </w:p>
     <w:p>
+      <w:r>
+        <w:rPr>
+          <w:i/>
+          <w:color w:val="52514E"/>
+        </w:rPr>
+        <w:t>Context: see 3.4 Compute in the infrastructure overview.</w:t>
+      </w:r>
+    </w:p>
+    <w:p>
       <w:pPr>
         <w:pStyle w:val="Heading3"/>
       </w:pPr>
@@ -2819,7 +6906,7 @@
       <w:r>
         <w:rPr>
           <w:b/>
-          <w:color w:val="FAB219"/>
+          <w:color w:val="9A6700"/>
         </w:rPr>
         <w:t>Low</w:t>
       </w:r>
@@ -2850,6 +6937,15 @@
       </w:r>
     </w:p>
     <w:p>
+      <w:r>
+        <w:rPr>
+          <w:i/>
+          <w:color w:val="52514E"/>
+        </w:rPr>
+        <w:t>Context: see 3.6 Storage in the infrastructure overview.</w:t>
+      </w:r>
+    </w:p>
+    <w:p>
       <w:pPr>
         <w:pStyle w:val="Heading3"/>
       </w:pPr>
@@ -2867,7 +6963,7 @@
       <w:r>
         <w:rPr>
           <w:b/>
-          <w:color w:val="FAB219"/>
+          <w:color w:val="9A6700"/>
         </w:rPr>
         <w:t>Low</w:t>
       </w:r>
@@ -2898,11 +6994,20 @@
       </w:r>
     </w:p>
     <w:p>
+      <w:r>
+        <w:rPr>
+          <w:i/>
+          <w:color w:val="52514E"/>
+        </w:rPr>
+        <w:t>Context: see 3.7 Databases in the infrastructure overview.</w:t>
+      </w:r>
+    </w:p>
+    <w:p>
       <w:pPr>
         <w:pStyle w:val="Heading2"/>
       </w:pPr>
       <w:r>
-        <w:t>4.3 Cost Optimization — 78/100 (Fair)</w:t>
+        <w:t>5.3 Cost Optimization — 78/100 (Fair)</w:t>
       </w:r>
     </w:p>
     <w:p>
@@ -2954,6 +7059,15 @@
       </w:r>
     </w:p>
     <w:p>
+      <w:r>
+        <w:rPr>
+          <w:i/>
+          <w:color w:val="52514E"/>
+        </w:rPr>
+        <w:t>Context: see 3.4 Compute in the infrastructure overview.</w:t>
+      </w:r>
+    </w:p>
+    <w:p>
       <w:pPr>
         <w:pStyle w:val="Heading3"/>
       </w:pPr>
@@ -2999,6 +7113,15 @@
       </w:r>
       <w:r>
         <w:t>disk-dev-orphan-0, disk-dev-orphan-1, disk-dev-orphan-2, disk-dev-orphan-3, disk-prd-orphan-0 …</w:t>
+      </w:r>
+    </w:p>
+    <w:p>
+      <w:r>
+        <w:rPr>
+          <w:i/>
+          <w:color w:val="52514E"/>
+        </w:rPr>
+        <w:t>Context: see 3.4 Compute in the infrastructure overview.</w:t>
       </w:r>
     </w:p>
     <w:p>
@@ -3050,6 +7173,15 @@
       </w:r>
     </w:p>
     <w:p>
+      <w:r>
+        <w:rPr>
+          <w:i/>
+          <w:color w:val="52514E"/>
+        </w:rPr>
+        <w:t>Context: see 3.8 Application hosting in the infrastructure overview.</w:t>
+      </w:r>
+    </w:p>
+    <w:p>
       <w:pPr>
         <w:pStyle w:val="Heading3"/>
       </w:pPr>
@@ -3067,7 +7199,7 @@
       <w:r>
         <w:rPr>
           <w:b/>
-          <w:color w:val="FAB219"/>
+          <w:color w:val="9A6700"/>
         </w:rPr>
         <w:t>Low</w:t>
       </w:r>
@@ -3098,6 +7230,15 @@
       </w:r>
     </w:p>
     <w:p>
+      <w:r>
+        <w:rPr>
+          <w:i/>
+          <w:color w:val="52514E"/>
+        </w:rPr>
+        <w:t>Context: see 3.5 Networking in the infrastructure overview.</w:t>
+      </w:r>
+    </w:p>
+    <w:p>
       <w:pPr>
         <w:pStyle w:val="Heading3"/>
       </w:pPr>
@@ -3115,7 +7256,7 @@
       <w:r>
         <w:rPr>
           <w:b/>
-          <w:color w:val="FAB219"/>
+          <w:color w:val="9A6700"/>
         </w:rPr>
         <w:t>Low</w:t>
       </w:r>
@@ -3146,11 +7287,20 @@
       </w:r>
     </w:p>
     <w:p>
+      <w:r>
+        <w:rPr>
+          <w:i/>
+          <w:color w:val="52514E"/>
+        </w:rPr>
+        <w:t>Context: see 3.4 Compute in the infrastructure overview.</w:t>
+      </w:r>
+    </w:p>
+    <w:p>
       <w:pPr>
         <w:pStyle w:val="Heading2"/>
       </w:pPr>
       <w:r>
-        <w:t>4.4 Operational Excellence — 73/100 (Fair)</w:t>
+        <w:t>5.4 Operational Excellence — 73/100 (Fair)</w:t>
       </w:r>
     </w:p>
     <w:p>
@@ -3171,7 +7321,7 @@
       <w:r>
         <w:rPr>
           <w:b/>
-          <w:color w:val="FAB219"/>
+          <w:color w:val="9A6700"/>
         </w:rPr>
         <w:t>Low</w:t>
       </w:r>
@@ -3202,6 +7352,15 @@
       </w:r>
     </w:p>
     <w:p>
+      <w:r>
+        <w:rPr>
+          <w:i/>
+          <w:color w:val="52514E"/>
+        </w:rPr>
+        <w:t>Context: see 3.4 Compute in the infrastructure overview.</w:t>
+      </w:r>
+    </w:p>
+    <w:p>
       <w:pPr>
         <w:pStyle w:val="Heading3"/>
       </w:pPr>
@@ -3219,7 +7378,7 @@
       <w:r>
         <w:rPr>
           <w:b/>
-          <w:color w:val="FAB219"/>
+          <w:color w:val="9A6700"/>
         </w:rPr>
         <w:t>Low</w:t>
       </w:r>
@@ -3250,11 +7409,20 @@
       </w:r>
     </w:p>
     <w:p>
+      <w:r>
+        <w:rPr>
+          <w:i/>
+          <w:color w:val="52514E"/>
+        </w:rPr>
+        <w:t>Context: see 3.10 Monitoring and management in the infrastructure overview.</w:t>
+      </w:r>
+    </w:p>
+    <w:p>
       <w:pPr>
         <w:pStyle w:val="Heading2"/>
       </w:pPr>
       <w:r>
-        <w:t>4.5 Governance — 84/100 (Good)</w:t>
+        <w:t>5.5 Governance — 84/100 (Good)</w:t>
       </w:r>
     </w:p>
     <w:p>
@@ -3306,6 +7474,15 @@
       </w:r>
     </w:p>
     <w:p>
+      <w:r>
+        <w:rPr>
+          <w:i/>
+          <w:color w:val="52514E"/>
+        </w:rPr>
+        <w:t>Context: see 3.11 Governance and tagging in the infrastructure overview.</w:t>
+      </w:r>
+    </w:p>
+    <w:p>
       <w:pPr>
         <w:pStyle w:val="Heading3"/>
       </w:pPr>
@@ -3351,6 +7528,15 @@
       </w:r>
       <w:r>
         <w:t>app-prd-01, asp-dev-00, asp-dev-01, disk-dev-orphan-0, disk-prd-orphan-3 …</w:t>
+      </w:r>
+    </w:p>
+    <w:p>
+      <w:r>
+        <w:rPr>
+          <w:i/>
+          <w:color w:val="52514E"/>
+        </w:rPr>
+        <w:t>Context: see 3.11 Governance and tagging in the infrastructure overview.</w:t>
       </w:r>
     </w:p>
     <w:p>
@@ -3402,11 +7588,20 @@
       </w:r>
     </w:p>
     <w:p>
+      <w:r>
+        <w:rPr>
+          <w:i/>
+          <w:color w:val="52514E"/>
+        </w:rPr>
+        <w:t>Context: see 3.3 Regional footprint in the infrastructure overview.</w:t>
+      </w:r>
+    </w:p>
+    <w:p>
       <w:pPr>
         <w:pStyle w:val="Heading1"/>
       </w:pPr>
       <w:r>
-        <w:t>5. Remediation roadmap</w:t>
+        <w:t>6. Remediation roadmap</w:t>
       </w:r>
     </w:p>
     <w:p>

</xml_diff>